<commit_message>
feat: cap nhat Website on tap Tin hoc GK1 (Lop 3-8), bo de DGDK1 Tuan 09-10 va LBG Tuan 09
</commit_message>
<xml_diff>
--- a/Hệ thống mẫu văn bản/Nguyên đã làm/Lịch báo giảng/Lịch báo giảng - Tuần 09 (THCS).docx
+++ b/Hệ thống mẫu văn bản/Nguyên đã làm/Lịch báo giảng/Lịch báo giảng - Tuần 09 (THCS).docx
@@ -1,6 +1,6 @@
 
 <file path=word/document.xml><?xml version="1.0" encoding="utf-8"?>
-<w:document xmlns:wpc="http://schemas.microsoft.com/office/word/2010/wordprocessingCanvas" xmlns:cx="http://schemas.microsoft.com/office/drawing/2014/chartex" xmlns:cx1="http://schemas.microsoft.com/office/drawing/2015/9/8/chartex" xmlns:cx2="http://schemas.microsoft.com/office/drawing/2015/10/21/chartex" xmlns:cx3="http://schemas.microsoft.com/office/drawing/2016/5/9/chartex" xmlns:cx4="http://schemas.microsoft.com/office/drawing/2016/5/10/chartex" xmlns:cx5="http://schemas.microsoft.com/office/drawing/2016/5/11/chartex" xmlns:cx6="http://schemas.microsoft.com/office/drawing/2016/5/12/chartex" xmlns:cx7="http://schemas.microsoft.com/office/drawing/2016/5/13/chartex" xmlns:cx8="http://schemas.microsoft.com/office/drawing/2016/5/14/chartex" xmlns:mc="http://schemas.openxmlformats.org/markup-compatibility/2006" xmlns:aink="http://schemas.microsoft.com/office/drawing/2016/ink" xmlns:am3d="http://schemas.microsoft.com/office/drawing/2017/model3d" xmlns:o="urn:schemas-microsoft-com:office:office" xmlns:oel="http://schemas.microsoft.com/office/2019/extlst" xmlns:r="http://schemas.openxmlformats.org/officeDocument/2006/relationships" xmlns:m="http://schemas.openxmlformats.org/officeDocument/2006/math" xmlns:v="urn:schemas-microsoft-com:vml" xmlns:wp14="http://schemas.microsoft.com/office/word/2010/wordprocessingDrawing" xmlns:wp="http://schemas.openxmlformats.org/drawingml/2006/wordprocessingDrawing" xmlns:w10="urn:schemas-microsoft-com:office:word" xmlns:w="http://schemas.openxmlformats.org/wordprocessingml/2006/main" xmlns:w14="http://schemas.microsoft.com/office/word/2010/wordml" xmlns:w15="http://schemas.microsoft.com/office/word/2012/wordml" xmlns:w16cei="http://schemas.microsoft.com/office/word/2026/wordml/cei" xmlns:w16cex="http://schemas.microsoft.com/office/word/2018/wordml/cex" xmlns:w16cid="http://schemas.microsoft.com/office/word/2016/wordml/cid" xmlns:w16="http://schemas.microsoft.com/office/word/2018/wordml" xmlns:w16du="http://schemas.microsoft.com/office/word/2023/wordml/word16du" xmlns:w16sdtdh="http://schemas.microsoft.com/office/word/2020/wordml/sdtdatahash" xmlns:w16sdtfl="http://schemas.microsoft.com/office/word/2024/wordml/sdtformatlock" xmlns:w16se="http://schemas.microsoft.com/office/word/2015/wordml/symex" xmlns:wpg="http://schemas.microsoft.com/office/word/2010/wordprocessingGroup" xmlns:wpi="http://schemas.microsoft.com/office/word/2010/wordprocessingInk" xmlns:wne="http://schemas.microsoft.com/office/word/2006/wordml" xmlns:wps="http://schemas.microsoft.com/office/word/2010/wordprocessingShape" mc:Ignorable="w14 w15 w16se w16cid w16 w16cex w16sdtdh w16sdtfl w16du wp14">
+<w:document xmlns:wpc="http://schemas.microsoft.com/office/word/2010/wordprocessingCanvas" xmlns:cx="http://schemas.microsoft.com/office/drawing/2014/chartex" xmlns:cx1="http://schemas.microsoft.com/office/drawing/2015/9/8/chartex" xmlns:cx2="http://schemas.microsoft.com/office/drawing/2015/10/21/chartex" xmlns:cx3="http://schemas.microsoft.com/office/drawing/2016/5/9/chartex" xmlns:cx4="http://schemas.microsoft.com/office/drawing/2016/5/10/chartex" xmlns:cx5="http://schemas.microsoft.com/office/drawing/2016/5/11/chartex" xmlns:cx6="http://schemas.microsoft.com/office/drawing/2016/5/12/chartex" xmlns:cx7="http://schemas.microsoft.com/office/drawing/2016/5/13/chartex" xmlns:cx8="http://schemas.microsoft.com/office/drawing/2016/5/14/chartex" xmlns:mc="http://schemas.openxmlformats.org/markup-compatibility/2006" xmlns:aink="http://schemas.microsoft.com/office/drawing/2016/ink" xmlns:am3d="http://schemas.microsoft.com/office/drawing/2017/model3d" xmlns:o="urn:schemas-microsoft-com:office:office" xmlns:oel="http://schemas.microsoft.com/office/2019/extlst" xmlns:r="http://schemas.openxmlformats.org/officeDocument/2006/relationships" xmlns:m="http://schemas.openxmlformats.org/officeDocument/2006/math" xmlns:v="urn:schemas-microsoft-com:vml" xmlns:wp14="http://schemas.microsoft.com/office/word/2010/wordprocessingDrawing" xmlns:wp="http://schemas.openxmlformats.org/drawingml/2006/wordprocessingDrawing" xmlns:w10="urn:schemas-microsoft-com:office:word" xmlns:w="http://schemas.openxmlformats.org/wordprocessingml/2006/main" xmlns:w14="http://schemas.microsoft.com/office/word/2010/wordml" xmlns:w15="http://schemas.microsoft.com/office/word/2012/wordml" xmlns:w16cex="http://schemas.microsoft.com/office/word/2018/wordml/cex" xmlns:w16cid="http://schemas.microsoft.com/office/word/2016/wordml/cid" xmlns:w16="http://schemas.microsoft.com/office/word/2018/wordml" xmlns:w16du="http://schemas.microsoft.com/office/word/2023/wordml/word16du" xmlns:w16sdtdh="http://schemas.microsoft.com/office/word/2020/wordml/sdtdatahash" xmlns:w16sdtfl="http://schemas.microsoft.com/office/word/2024/wordml/sdtformatlock" xmlns:w16se="http://schemas.microsoft.com/office/word/2015/wordml/symex" xmlns:wpg="http://schemas.microsoft.com/office/word/2010/wordprocessingGroup" xmlns:wpi="http://schemas.microsoft.com/office/word/2010/wordprocessingInk" xmlns:wne="http://schemas.microsoft.com/office/word/2006/wordml" xmlns:wps="http://schemas.microsoft.com/office/word/2010/wordprocessingShape" mc:Ignorable="w14 w15 w16se w16cid w16 w16cex w16sdtdh w16sdtfl w16du wp14">
   <w:body>
     <w:p>
       <w:pPr>
@@ -394,12 +394,6 @@
                 <w:szCs w:val="26"/>
               </w:rPr>
             </w:pPr>
-            <w:r>
-              <w:rPr>
-                <w:rFonts w:ascii="Times New Roman" w:hAnsi="Times New Roman"/>
-                <w:sz w:val="26"/>
-              </w:rPr>
-            </w:r>
           </w:p>
         </w:tc>
         <w:tc>
@@ -421,12 +415,6 @@
                 <w:szCs w:val="26"/>
               </w:rPr>
             </w:pPr>
-            <w:r>
-              <w:rPr>
-                <w:rFonts w:ascii="Times New Roman" w:hAnsi="Times New Roman"/>
-                <w:sz w:val="26"/>
-              </w:rPr>
-            </w:r>
           </w:p>
         </w:tc>
         <w:tc>
@@ -448,12 +436,6 @@
                 <w:szCs w:val="26"/>
               </w:rPr>
             </w:pPr>
-            <w:r>
-              <w:rPr>
-                <w:rFonts w:ascii="Times New Roman" w:hAnsi="Times New Roman"/>
-                <w:sz w:val="26"/>
-              </w:rPr>
-            </w:r>
           </w:p>
         </w:tc>
         <w:tc>
@@ -475,12 +457,6 @@
                 <w:szCs w:val="26"/>
               </w:rPr>
             </w:pPr>
-            <w:r>
-              <w:rPr>
-                <w:rFonts w:ascii="Times New Roman" w:hAnsi="Times New Roman"/>
-                <w:sz w:val="26"/>
-              </w:rPr>
-            </w:r>
           </w:p>
         </w:tc>
         <w:tc>
@@ -502,12 +478,6 @@
                 <w:szCs w:val="26"/>
               </w:rPr>
             </w:pPr>
-            <w:r>
-              <w:rPr>
-                <w:rFonts w:ascii="Times New Roman" w:hAnsi="Times New Roman"/>
-                <w:sz w:val="26"/>
-              </w:rPr>
-            </w:r>
           </w:p>
         </w:tc>
       </w:tr>
@@ -585,12 +555,6 @@
                 <w:szCs w:val="26"/>
               </w:rPr>
             </w:pPr>
-            <w:r>
-              <w:rPr>
-                <w:rFonts w:ascii="Times New Roman" w:hAnsi="Times New Roman"/>
-                <w:sz w:val="26"/>
-              </w:rPr>
-            </w:r>
           </w:p>
         </w:tc>
         <w:tc>
@@ -612,12 +576,6 @@
                 <w:szCs w:val="26"/>
               </w:rPr>
             </w:pPr>
-            <w:r>
-              <w:rPr>
-                <w:rFonts w:ascii="Times New Roman" w:hAnsi="Times New Roman"/>
-                <w:sz w:val="26"/>
-              </w:rPr>
-            </w:r>
           </w:p>
         </w:tc>
         <w:tc>
@@ -639,12 +597,6 @@
                 <w:szCs w:val="26"/>
               </w:rPr>
             </w:pPr>
-            <w:r>
-              <w:rPr>
-                <w:rFonts w:ascii="Times New Roman" w:hAnsi="Times New Roman"/>
-                <w:sz w:val="26"/>
-              </w:rPr>
-            </w:r>
           </w:p>
         </w:tc>
         <w:tc>
@@ -666,12 +618,6 @@
                 <w:szCs w:val="26"/>
               </w:rPr>
             </w:pPr>
-            <w:r>
-              <w:rPr>
-                <w:rFonts w:ascii="Times New Roman" w:hAnsi="Times New Roman"/>
-                <w:sz w:val="26"/>
-              </w:rPr>
-            </w:r>
           </w:p>
         </w:tc>
         <w:tc>
@@ -693,12 +639,6 @@
                 <w:szCs w:val="26"/>
               </w:rPr>
             </w:pPr>
-            <w:r>
-              <w:rPr>
-                <w:rFonts w:ascii="Times New Roman" w:hAnsi="Times New Roman"/>
-                <w:sz w:val="26"/>
-              </w:rPr>
-            </w:r>
           </w:p>
         </w:tc>
       </w:tr>
@@ -776,12 +716,6 @@
                 <w:szCs w:val="26"/>
               </w:rPr>
             </w:pPr>
-            <w:r>
-              <w:rPr>
-                <w:rFonts w:ascii="Times New Roman" w:hAnsi="Times New Roman"/>
-                <w:sz w:val="26"/>
-              </w:rPr>
-            </w:r>
           </w:p>
         </w:tc>
         <w:tc>
@@ -803,12 +737,6 @@
                 <w:szCs w:val="26"/>
               </w:rPr>
             </w:pPr>
-            <w:r>
-              <w:rPr>
-                <w:rFonts w:ascii="Times New Roman" w:hAnsi="Times New Roman"/>
-                <w:sz w:val="26"/>
-              </w:rPr>
-            </w:r>
           </w:p>
         </w:tc>
         <w:tc>
@@ -830,12 +758,6 @@
                 <w:szCs w:val="26"/>
               </w:rPr>
             </w:pPr>
-            <w:r>
-              <w:rPr>
-                <w:rFonts w:ascii="Times New Roman" w:hAnsi="Times New Roman"/>
-                <w:sz w:val="26"/>
-              </w:rPr>
-            </w:r>
           </w:p>
         </w:tc>
         <w:tc>
@@ -857,12 +779,6 @@
                 <w:szCs w:val="26"/>
               </w:rPr>
             </w:pPr>
-            <w:r>
-              <w:rPr>
-                <w:rFonts w:ascii="Times New Roman" w:hAnsi="Times New Roman"/>
-                <w:sz w:val="26"/>
-              </w:rPr>
-            </w:r>
           </w:p>
         </w:tc>
         <w:tc>
@@ -884,12 +800,6 @@
                 <w:szCs w:val="26"/>
               </w:rPr>
             </w:pPr>
-            <w:r>
-              <w:rPr>
-                <w:rFonts w:ascii="Times New Roman" w:hAnsi="Times New Roman"/>
-                <w:sz w:val="26"/>
-              </w:rPr>
-            </w:r>
           </w:p>
         </w:tc>
       </w:tr>
@@ -967,13 +877,6 @@
                 <w:szCs w:val="26"/>
               </w:rPr>
             </w:pPr>
-            <w:r>
-              <w:rPr>
-                <w:rFonts w:ascii="Times New Roman" w:hAnsi="Times New Roman" w:cs="Times New Roman"/>
-                <w:sz w:val="26"/>
-                <w:szCs w:val="26"/>
-              </w:rPr>
-            </w:r>
           </w:p>
         </w:tc>
         <w:tc>
@@ -995,13 +898,6 @@
                 <w:szCs w:val="26"/>
               </w:rPr>
             </w:pPr>
-            <w:r>
-              <w:rPr>
-                <w:rFonts w:ascii="Times New Roman" w:hAnsi="Times New Roman" w:cs="Times New Roman"/>
-                <w:sz w:val="26"/>
-                <w:szCs w:val="26"/>
-              </w:rPr>
-            </w:r>
           </w:p>
         </w:tc>
         <w:tc>
@@ -1023,13 +919,6 @@
                 <w:szCs w:val="26"/>
               </w:rPr>
             </w:pPr>
-            <w:r>
-              <w:rPr>
-                <w:rFonts w:ascii="Times New Roman" w:hAnsi="Times New Roman" w:cs="Times New Roman"/>
-                <w:sz w:val="26"/>
-                <w:szCs w:val="26"/>
-              </w:rPr>
-            </w:r>
           </w:p>
         </w:tc>
         <w:tc>
@@ -1051,13 +940,6 @@
                 <w:szCs w:val="26"/>
               </w:rPr>
             </w:pPr>
-            <w:r>
-              <w:rPr>
-                <w:rFonts w:ascii="Times New Roman" w:hAnsi="Times New Roman" w:cs="Times New Roman"/>
-                <w:sz w:val="26"/>
-                <w:szCs w:val="26"/>
-              </w:rPr>
-            </w:r>
           </w:p>
         </w:tc>
         <w:tc>
@@ -1079,13 +961,6 @@
                 <w:szCs w:val="26"/>
               </w:rPr>
             </w:pPr>
-            <w:r>
-              <w:rPr>
-                <w:rFonts w:ascii="Times New Roman" w:hAnsi="Times New Roman" w:cs="Times New Roman"/>
-                <w:sz w:val="26"/>
-                <w:szCs w:val="26"/>
-              </w:rPr>
-            </w:r>
           </w:p>
         </w:tc>
       </w:tr>
@@ -1163,12 +1038,6 @@
                 <w:szCs w:val="26"/>
               </w:rPr>
             </w:pPr>
-            <w:r>
-              <w:rPr>
-                <w:rFonts w:ascii="Times New Roman" w:hAnsi="Times New Roman"/>
-                <w:sz w:val="26"/>
-              </w:rPr>
-            </w:r>
           </w:p>
         </w:tc>
         <w:tc>
@@ -1190,12 +1059,6 @@
                 <w:szCs w:val="26"/>
               </w:rPr>
             </w:pPr>
-            <w:r>
-              <w:rPr>
-                <w:rFonts w:ascii="Times New Roman" w:hAnsi="Times New Roman"/>
-                <w:sz w:val="26"/>
-              </w:rPr>
-            </w:r>
           </w:p>
         </w:tc>
         <w:tc>
@@ -1217,12 +1080,6 @@
                 <w:szCs w:val="26"/>
               </w:rPr>
             </w:pPr>
-            <w:r>
-              <w:rPr>
-                <w:rFonts w:ascii="Times New Roman" w:hAnsi="Times New Roman"/>
-                <w:sz w:val="26"/>
-              </w:rPr>
-            </w:r>
           </w:p>
         </w:tc>
         <w:tc>
@@ -1244,12 +1101,6 @@
                 <w:szCs w:val="26"/>
               </w:rPr>
             </w:pPr>
-            <w:r>
-              <w:rPr>
-                <w:rFonts w:ascii="Times New Roman" w:hAnsi="Times New Roman"/>
-                <w:sz w:val="26"/>
-              </w:rPr>
-            </w:r>
           </w:p>
         </w:tc>
         <w:tc>
@@ -1271,12 +1122,6 @@
                 <w:szCs w:val="26"/>
               </w:rPr>
             </w:pPr>
-            <w:r>
-              <w:rPr>
-                <w:rFonts w:ascii="Times New Roman" w:hAnsi="Times New Roman"/>
-                <w:sz w:val="26"/>
-              </w:rPr>
-            </w:r>
           </w:p>
         </w:tc>
       </w:tr>
@@ -1360,12 +1205,6 @@
                 <w:szCs w:val="26"/>
               </w:rPr>
             </w:pPr>
-            <w:r>
-              <w:rPr>
-                <w:rFonts w:ascii="Times New Roman" w:hAnsi="Times New Roman"/>
-                <w:sz w:val="26"/>
-              </w:rPr>
-            </w:r>
           </w:p>
         </w:tc>
         <w:tc>
@@ -1387,12 +1226,6 @@
                 <w:szCs w:val="26"/>
               </w:rPr>
             </w:pPr>
-            <w:r>
-              <w:rPr>
-                <w:rFonts w:ascii="Times New Roman" w:hAnsi="Times New Roman"/>
-                <w:sz w:val="26"/>
-              </w:rPr>
-            </w:r>
           </w:p>
         </w:tc>
         <w:tc>
@@ -1414,12 +1247,6 @@
                 <w:szCs w:val="26"/>
               </w:rPr>
             </w:pPr>
-            <w:r>
-              <w:rPr>
-                <w:rFonts w:ascii="Times New Roman" w:hAnsi="Times New Roman"/>
-                <w:sz w:val="26"/>
-              </w:rPr>
-            </w:r>
           </w:p>
         </w:tc>
         <w:tc>
@@ -1441,12 +1268,6 @@
                 <w:szCs w:val="26"/>
               </w:rPr>
             </w:pPr>
-            <w:r>
-              <w:rPr>
-                <w:rFonts w:ascii="Times New Roman" w:hAnsi="Times New Roman"/>
-                <w:sz w:val="26"/>
-              </w:rPr>
-            </w:r>
           </w:p>
         </w:tc>
         <w:tc>
@@ -1468,12 +1289,6 @@
                 <w:szCs w:val="26"/>
               </w:rPr>
             </w:pPr>
-            <w:r>
-              <w:rPr>
-                <w:rFonts w:ascii="Times New Roman" w:hAnsi="Times New Roman"/>
-                <w:sz w:val="26"/>
-              </w:rPr>
-            </w:r>
           </w:p>
         </w:tc>
       </w:tr>
@@ -1553,12 +1368,6 @@
                 <w:szCs w:val="26"/>
               </w:rPr>
             </w:pPr>
-            <w:r>
-              <w:rPr>
-                <w:rFonts w:ascii="Times New Roman" w:hAnsi="Times New Roman"/>
-                <w:sz w:val="26"/>
-              </w:rPr>
-            </w:r>
           </w:p>
         </w:tc>
         <w:tc>
@@ -1580,12 +1389,6 @@
                 <w:szCs w:val="26"/>
               </w:rPr>
             </w:pPr>
-            <w:r>
-              <w:rPr>
-                <w:rFonts w:ascii="Times New Roman" w:hAnsi="Times New Roman"/>
-                <w:sz w:val="26"/>
-              </w:rPr>
-            </w:r>
           </w:p>
         </w:tc>
         <w:tc>
@@ -1607,12 +1410,6 @@
                 <w:szCs w:val="26"/>
               </w:rPr>
             </w:pPr>
-            <w:r>
-              <w:rPr>
-                <w:rFonts w:ascii="Times New Roman" w:hAnsi="Times New Roman"/>
-                <w:sz w:val="26"/>
-              </w:rPr>
-            </w:r>
           </w:p>
         </w:tc>
         <w:tc>
@@ -1634,12 +1431,6 @@
                 <w:szCs w:val="26"/>
               </w:rPr>
             </w:pPr>
-            <w:r>
-              <w:rPr>
-                <w:rFonts w:ascii="Times New Roman" w:hAnsi="Times New Roman"/>
-                <w:sz w:val="26"/>
-              </w:rPr>
-            </w:r>
           </w:p>
         </w:tc>
         <w:tc>
@@ -1661,12 +1452,6 @@
                 <w:szCs w:val="26"/>
               </w:rPr>
             </w:pPr>
-            <w:r>
-              <w:rPr>
-                <w:rFonts w:ascii="Times New Roman" w:hAnsi="Times New Roman"/>
-                <w:sz w:val="26"/>
-              </w:rPr>
-            </w:r>
           </w:p>
         </w:tc>
       </w:tr>
@@ -1746,13 +1531,6 @@
                 <w:szCs w:val="26"/>
               </w:rPr>
             </w:pPr>
-            <w:r>
-              <w:rPr>
-                <w:rFonts w:ascii="Times New Roman" w:hAnsi="Times New Roman" w:cs="Times New Roman"/>
-                <w:sz w:val="26"/>
-                <w:szCs w:val="26"/>
-              </w:rPr>
-            </w:r>
           </w:p>
         </w:tc>
         <w:tc>
@@ -1774,13 +1552,6 @@
                 <w:szCs w:val="26"/>
               </w:rPr>
             </w:pPr>
-            <w:r>
-              <w:rPr>
-                <w:rFonts w:ascii="Times New Roman" w:hAnsi="Times New Roman" w:cs="Times New Roman"/>
-                <w:sz w:val="26"/>
-                <w:szCs w:val="26"/>
-              </w:rPr>
-            </w:r>
           </w:p>
         </w:tc>
         <w:tc>
@@ -1802,13 +1573,6 @@
                 <w:szCs w:val="26"/>
               </w:rPr>
             </w:pPr>
-            <w:r>
-              <w:rPr>
-                <w:rFonts w:ascii="Times New Roman" w:hAnsi="Times New Roman" w:cs="Times New Roman"/>
-                <w:sz w:val="26"/>
-                <w:szCs w:val="26"/>
-              </w:rPr>
-            </w:r>
           </w:p>
         </w:tc>
         <w:tc>
@@ -1830,13 +1594,6 @@
                 <w:szCs w:val="26"/>
               </w:rPr>
             </w:pPr>
-            <w:r>
-              <w:rPr>
-                <w:rFonts w:ascii="Times New Roman" w:hAnsi="Times New Roman" w:cs="Times New Roman"/>
-                <w:sz w:val="26"/>
-                <w:szCs w:val="26"/>
-              </w:rPr>
-            </w:r>
           </w:p>
         </w:tc>
         <w:tc>
@@ -1858,13 +1615,6 @@
                 <w:szCs w:val="26"/>
               </w:rPr>
             </w:pPr>
-            <w:r>
-              <w:rPr>
-                <w:rFonts w:ascii="Times New Roman" w:hAnsi="Times New Roman" w:cs="Times New Roman"/>
-                <w:sz w:val="26"/>
-                <w:szCs w:val="26"/>
-              </w:rPr>
-            </w:r>
           </w:p>
         </w:tc>
       </w:tr>
@@ -1944,13 +1694,6 @@
                 <w:szCs w:val="26"/>
               </w:rPr>
             </w:pPr>
-            <w:r>
-              <w:rPr>
-                <w:rFonts w:ascii="Times New Roman" w:hAnsi="Times New Roman" w:cs="Times New Roman"/>
-                <w:sz w:val="26"/>
-                <w:szCs w:val="26"/>
-              </w:rPr>
-            </w:r>
           </w:p>
         </w:tc>
         <w:tc>
@@ -1972,13 +1715,6 @@
                 <w:szCs w:val="26"/>
               </w:rPr>
             </w:pPr>
-            <w:r>
-              <w:rPr>
-                <w:rFonts w:ascii="Times New Roman" w:hAnsi="Times New Roman" w:cs="Times New Roman"/>
-                <w:sz w:val="26"/>
-                <w:szCs w:val="26"/>
-              </w:rPr>
-            </w:r>
           </w:p>
         </w:tc>
         <w:tc>
@@ -2000,13 +1736,6 @@
                 <w:szCs w:val="26"/>
               </w:rPr>
             </w:pPr>
-            <w:r>
-              <w:rPr>
-                <w:rFonts w:ascii="Times New Roman" w:hAnsi="Times New Roman" w:cs="Times New Roman"/>
-                <w:sz w:val="26"/>
-                <w:szCs w:val="26"/>
-              </w:rPr>
-            </w:r>
           </w:p>
         </w:tc>
         <w:tc>
@@ -2028,13 +1757,6 @@
                 <w:szCs w:val="26"/>
               </w:rPr>
             </w:pPr>
-            <w:r>
-              <w:rPr>
-                <w:rFonts w:ascii="Times New Roman" w:hAnsi="Times New Roman" w:cs="Times New Roman"/>
-                <w:sz w:val="26"/>
-                <w:szCs w:val="26"/>
-              </w:rPr>
-            </w:r>
           </w:p>
         </w:tc>
         <w:tc>
@@ -2056,13 +1778,6 @@
                 <w:szCs w:val="26"/>
               </w:rPr>
             </w:pPr>
-            <w:r>
-              <w:rPr>
-                <w:rFonts w:ascii="Times New Roman" w:hAnsi="Times New Roman" w:cs="Times New Roman"/>
-                <w:sz w:val="26"/>
-                <w:szCs w:val="26"/>
-              </w:rPr>
-            </w:r>
           </w:p>
         </w:tc>
       </w:tr>
@@ -2142,12 +1857,6 @@
                 <w:szCs w:val="26"/>
               </w:rPr>
             </w:pPr>
-            <w:r>
-              <w:rPr>
-                <w:rFonts w:ascii="Times New Roman" w:hAnsi="Times New Roman"/>
-                <w:sz w:val="26"/>
-              </w:rPr>
-            </w:r>
           </w:p>
         </w:tc>
         <w:tc>
@@ -2169,12 +1878,6 @@
                 <w:szCs w:val="26"/>
               </w:rPr>
             </w:pPr>
-            <w:r>
-              <w:rPr>
-                <w:rFonts w:ascii="Times New Roman" w:hAnsi="Times New Roman"/>
-                <w:sz w:val="26"/>
-              </w:rPr>
-            </w:r>
           </w:p>
         </w:tc>
         <w:tc>
@@ -2196,12 +1899,6 @@
                 <w:szCs w:val="26"/>
               </w:rPr>
             </w:pPr>
-            <w:r>
-              <w:rPr>
-                <w:rFonts w:ascii="Times New Roman" w:hAnsi="Times New Roman"/>
-                <w:sz w:val="26"/>
-              </w:rPr>
-            </w:r>
           </w:p>
         </w:tc>
         <w:tc>
@@ -2223,12 +1920,6 @@
                 <w:szCs w:val="26"/>
               </w:rPr>
             </w:pPr>
-            <w:r>
-              <w:rPr>
-                <w:rFonts w:ascii="Times New Roman" w:hAnsi="Times New Roman"/>
-                <w:sz w:val="26"/>
-              </w:rPr>
-            </w:r>
           </w:p>
         </w:tc>
         <w:tc>
@@ -2250,12 +1941,6 @@
                 <w:szCs w:val="26"/>
               </w:rPr>
             </w:pPr>
-            <w:r>
-              <w:rPr>
-                <w:rFonts w:ascii="Times New Roman" w:hAnsi="Times New Roman"/>
-                <w:sz w:val="26"/>
-              </w:rPr>
-            </w:r>
           </w:p>
         </w:tc>
       </w:tr>
@@ -2339,12 +2024,6 @@
                 <w:szCs w:val="26"/>
               </w:rPr>
             </w:pPr>
-            <w:r>
-              <w:rPr>
-                <w:rFonts w:ascii="Times New Roman" w:hAnsi="Times New Roman"/>
-                <w:sz w:val="26"/>
-              </w:rPr>
-            </w:r>
           </w:p>
         </w:tc>
         <w:tc>
@@ -2366,12 +2045,6 @@
                 <w:szCs w:val="26"/>
               </w:rPr>
             </w:pPr>
-            <w:r>
-              <w:rPr>
-                <w:rFonts w:ascii="Times New Roman" w:hAnsi="Times New Roman"/>
-                <w:sz w:val="26"/>
-              </w:rPr>
-            </w:r>
           </w:p>
         </w:tc>
         <w:tc>
@@ -2393,12 +2066,6 @@
                 <w:szCs w:val="26"/>
               </w:rPr>
             </w:pPr>
-            <w:r>
-              <w:rPr>
-                <w:rFonts w:ascii="Times New Roman" w:hAnsi="Times New Roman"/>
-                <w:sz w:val="26"/>
-              </w:rPr>
-            </w:r>
           </w:p>
         </w:tc>
         <w:tc>
@@ -2420,12 +2087,6 @@
                 <w:szCs w:val="26"/>
               </w:rPr>
             </w:pPr>
-            <w:r>
-              <w:rPr>
-                <w:rFonts w:ascii="Times New Roman" w:hAnsi="Times New Roman"/>
-                <w:sz w:val="26"/>
-              </w:rPr>
-            </w:r>
           </w:p>
         </w:tc>
         <w:tc>
@@ -2447,12 +2108,6 @@
                 <w:szCs w:val="26"/>
               </w:rPr>
             </w:pPr>
-            <w:r>
-              <w:rPr>
-                <w:rFonts w:ascii="Times New Roman" w:hAnsi="Times New Roman"/>
-                <w:sz w:val="26"/>
-              </w:rPr>
-            </w:r>
           </w:p>
         </w:tc>
       </w:tr>
@@ -2532,13 +2187,6 @@
                 <w:szCs w:val="26"/>
               </w:rPr>
             </w:pPr>
-            <w:r>
-              <w:rPr>
-                <w:rFonts w:ascii="Times New Roman" w:hAnsi="Times New Roman" w:cs="Times New Roman"/>
-                <w:sz w:val="26"/>
-                <w:szCs w:val="26"/>
-              </w:rPr>
-            </w:r>
           </w:p>
         </w:tc>
         <w:tc>
@@ -2560,13 +2208,6 @@
                 <w:szCs w:val="26"/>
               </w:rPr>
             </w:pPr>
-            <w:r>
-              <w:rPr>
-                <w:rFonts w:ascii="Times New Roman" w:hAnsi="Times New Roman" w:cs="Times New Roman"/>
-                <w:sz w:val="26"/>
-                <w:szCs w:val="26"/>
-              </w:rPr>
-            </w:r>
           </w:p>
         </w:tc>
         <w:tc>
@@ -2588,13 +2229,6 @@
                 <w:szCs w:val="26"/>
               </w:rPr>
             </w:pPr>
-            <w:r>
-              <w:rPr>
-                <w:rFonts w:ascii="Times New Roman" w:hAnsi="Times New Roman" w:cs="Times New Roman"/>
-                <w:sz w:val="26"/>
-                <w:szCs w:val="26"/>
-              </w:rPr>
-            </w:r>
           </w:p>
         </w:tc>
         <w:tc>
@@ -2616,13 +2250,6 @@
                 <w:szCs w:val="26"/>
               </w:rPr>
             </w:pPr>
-            <w:r>
-              <w:rPr>
-                <w:rFonts w:ascii="Times New Roman" w:hAnsi="Times New Roman" w:cs="Times New Roman"/>
-                <w:sz w:val="26"/>
-                <w:szCs w:val="26"/>
-              </w:rPr>
-            </w:r>
           </w:p>
         </w:tc>
         <w:tc>
@@ -2644,13 +2271,6 @@
                 <w:szCs w:val="26"/>
               </w:rPr>
             </w:pPr>
-            <w:r>
-              <w:rPr>
-                <w:rFonts w:ascii="Times New Roman" w:hAnsi="Times New Roman" w:cs="Times New Roman"/>
-                <w:sz w:val="26"/>
-                <w:szCs w:val="26"/>
-              </w:rPr>
-            </w:r>
           </w:p>
         </w:tc>
       </w:tr>
@@ -2730,12 +2350,6 @@
                 <w:szCs w:val="26"/>
               </w:rPr>
             </w:pPr>
-            <w:r>
-              <w:rPr>
-                <w:rFonts w:ascii="Times New Roman" w:hAnsi="Times New Roman"/>
-                <w:sz w:val="26"/>
-              </w:rPr>
-            </w:r>
           </w:p>
         </w:tc>
         <w:tc>
@@ -2757,12 +2371,6 @@
                 <w:szCs w:val="26"/>
               </w:rPr>
             </w:pPr>
-            <w:r>
-              <w:rPr>
-                <w:rFonts w:ascii="Times New Roman" w:hAnsi="Times New Roman"/>
-                <w:sz w:val="26"/>
-              </w:rPr>
-            </w:r>
           </w:p>
         </w:tc>
         <w:tc>
@@ -2784,12 +2392,6 @@
                 <w:szCs w:val="26"/>
               </w:rPr>
             </w:pPr>
-            <w:r>
-              <w:rPr>
-                <w:rFonts w:ascii="Times New Roman" w:hAnsi="Times New Roman"/>
-                <w:sz w:val="26"/>
-              </w:rPr>
-            </w:r>
           </w:p>
         </w:tc>
         <w:tc>
@@ -2811,12 +2413,6 @@
                 <w:szCs w:val="26"/>
               </w:rPr>
             </w:pPr>
-            <w:r>
-              <w:rPr>
-                <w:rFonts w:ascii="Times New Roman" w:hAnsi="Times New Roman"/>
-                <w:sz w:val="26"/>
-              </w:rPr>
-            </w:r>
           </w:p>
         </w:tc>
         <w:tc>
@@ -2838,12 +2434,6 @@
                 <w:szCs w:val="26"/>
               </w:rPr>
             </w:pPr>
-            <w:r>
-              <w:rPr>
-                <w:rFonts w:ascii="Times New Roman" w:hAnsi="Times New Roman"/>
-                <w:sz w:val="26"/>
-              </w:rPr>
-            </w:r>
           </w:p>
         </w:tc>
       </w:tr>
@@ -2923,13 +2513,6 @@
                 <w:szCs w:val="26"/>
               </w:rPr>
             </w:pPr>
-            <w:r>
-              <w:rPr>
-                <w:rFonts w:ascii="Times New Roman" w:hAnsi="Times New Roman" w:cs="Times New Roman"/>
-                <w:sz w:val="26"/>
-                <w:szCs w:val="26"/>
-              </w:rPr>
-            </w:r>
           </w:p>
         </w:tc>
         <w:tc>
@@ -2951,13 +2534,6 @@
                 <w:szCs w:val="26"/>
               </w:rPr>
             </w:pPr>
-            <w:r>
-              <w:rPr>
-                <w:rFonts w:ascii="Times New Roman" w:hAnsi="Times New Roman" w:cs="Times New Roman"/>
-                <w:sz w:val="26"/>
-                <w:szCs w:val="26"/>
-              </w:rPr>
-            </w:r>
           </w:p>
         </w:tc>
         <w:tc>
@@ -2979,13 +2555,6 @@
                 <w:szCs w:val="26"/>
               </w:rPr>
             </w:pPr>
-            <w:r>
-              <w:rPr>
-                <w:rFonts w:ascii="Times New Roman" w:hAnsi="Times New Roman" w:cs="Times New Roman"/>
-                <w:sz w:val="26"/>
-                <w:szCs w:val="26"/>
-              </w:rPr>
-            </w:r>
           </w:p>
         </w:tc>
         <w:tc>
@@ -3007,13 +2576,6 @@
                 <w:szCs w:val="26"/>
               </w:rPr>
             </w:pPr>
-            <w:r>
-              <w:rPr>
-                <w:rFonts w:ascii="Times New Roman" w:hAnsi="Times New Roman" w:cs="Times New Roman"/>
-                <w:sz w:val="26"/>
-                <w:szCs w:val="26"/>
-              </w:rPr>
-            </w:r>
           </w:p>
         </w:tc>
         <w:tc>
@@ -3035,13 +2597,6 @@
                 <w:szCs w:val="26"/>
               </w:rPr>
             </w:pPr>
-            <w:r>
-              <w:rPr>
-                <w:rFonts w:ascii="Times New Roman" w:hAnsi="Times New Roman" w:cs="Times New Roman"/>
-                <w:sz w:val="26"/>
-                <w:szCs w:val="26"/>
-              </w:rPr>
-            </w:r>
           </w:p>
         </w:tc>
       </w:tr>
@@ -3121,12 +2676,6 @@
                 <w:szCs w:val="26"/>
               </w:rPr>
             </w:pPr>
-            <w:r>
-              <w:rPr>
-                <w:rFonts w:ascii="Times New Roman" w:hAnsi="Times New Roman"/>
-                <w:sz w:val="26"/>
-              </w:rPr>
-            </w:r>
           </w:p>
         </w:tc>
         <w:tc>
@@ -3148,12 +2697,6 @@
                 <w:szCs w:val="26"/>
               </w:rPr>
             </w:pPr>
-            <w:r>
-              <w:rPr>
-                <w:rFonts w:ascii="Times New Roman" w:hAnsi="Times New Roman"/>
-                <w:sz w:val="26"/>
-              </w:rPr>
-            </w:r>
           </w:p>
         </w:tc>
         <w:tc>
@@ -3175,12 +2718,6 @@
                 <w:szCs w:val="26"/>
               </w:rPr>
             </w:pPr>
-            <w:r>
-              <w:rPr>
-                <w:rFonts w:ascii="Times New Roman" w:hAnsi="Times New Roman"/>
-                <w:sz w:val="26"/>
-              </w:rPr>
-            </w:r>
           </w:p>
         </w:tc>
         <w:tc>
@@ -3202,12 +2739,6 @@
                 <w:szCs w:val="26"/>
               </w:rPr>
             </w:pPr>
-            <w:r>
-              <w:rPr>
-                <w:rFonts w:ascii="Times New Roman" w:hAnsi="Times New Roman"/>
-                <w:sz w:val="26"/>
-              </w:rPr>
-            </w:r>
           </w:p>
         </w:tc>
         <w:tc>
@@ -3229,12 +2760,6 @@
                 <w:szCs w:val="26"/>
               </w:rPr>
             </w:pPr>
-            <w:r>
-              <w:rPr>
-                <w:rFonts w:ascii="Times New Roman" w:hAnsi="Times New Roman"/>
-                <w:sz w:val="26"/>
-              </w:rPr>
-            </w:r>
           </w:p>
         </w:tc>
       </w:tr>
@@ -3318,13 +2843,6 @@
                 <w:szCs w:val="26"/>
               </w:rPr>
             </w:pPr>
-            <w:r>
-              <w:rPr>
-                <w:rFonts w:ascii="Times New Roman" w:hAnsi="Times New Roman" w:cs="Times New Roman"/>
-                <w:sz w:val="26"/>
-                <w:szCs w:val="26"/>
-              </w:rPr>
-            </w:r>
           </w:p>
         </w:tc>
         <w:tc>
@@ -3346,13 +2864,6 @@
                 <w:szCs w:val="26"/>
               </w:rPr>
             </w:pPr>
-            <w:r>
-              <w:rPr>
-                <w:rFonts w:ascii="Times New Roman" w:hAnsi="Times New Roman" w:cs="Times New Roman"/>
-                <w:sz w:val="26"/>
-                <w:szCs w:val="26"/>
-              </w:rPr>
-            </w:r>
           </w:p>
         </w:tc>
         <w:tc>
@@ -3374,13 +2885,6 @@
                 <w:szCs w:val="26"/>
               </w:rPr>
             </w:pPr>
-            <w:r>
-              <w:rPr>
-                <w:rFonts w:ascii="Times New Roman" w:hAnsi="Times New Roman" w:cs="Times New Roman"/>
-                <w:sz w:val="26"/>
-                <w:szCs w:val="26"/>
-              </w:rPr>
-            </w:r>
           </w:p>
         </w:tc>
         <w:tc>
@@ -3402,13 +2906,6 @@
                 <w:szCs w:val="26"/>
               </w:rPr>
             </w:pPr>
-            <w:r>
-              <w:rPr>
-                <w:rFonts w:ascii="Times New Roman" w:hAnsi="Times New Roman" w:cs="Times New Roman"/>
-                <w:sz w:val="26"/>
-                <w:szCs w:val="26"/>
-              </w:rPr>
-            </w:r>
           </w:p>
         </w:tc>
         <w:tc>
@@ -3430,13 +2927,6 @@
                 <w:szCs w:val="26"/>
               </w:rPr>
             </w:pPr>
-            <w:r>
-              <w:rPr>
-                <w:rFonts w:ascii="Times New Roman" w:hAnsi="Times New Roman" w:cs="Times New Roman"/>
-                <w:sz w:val="26"/>
-                <w:szCs w:val="26"/>
-              </w:rPr>
-            </w:r>
           </w:p>
         </w:tc>
       </w:tr>
@@ -3516,13 +3006,6 @@
                 <w:szCs w:val="26"/>
               </w:rPr>
             </w:pPr>
-            <w:r>
-              <w:rPr>
-                <w:rFonts w:ascii="Times New Roman" w:hAnsi="Times New Roman" w:cs="Times New Roman"/>
-                <w:sz w:val="26"/>
-                <w:szCs w:val="26"/>
-              </w:rPr>
-            </w:r>
           </w:p>
         </w:tc>
         <w:tc>
@@ -3544,13 +3027,6 @@
                 <w:szCs w:val="26"/>
               </w:rPr>
             </w:pPr>
-            <w:r>
-              <w:rPr>
-                <w:rFonts w:ascii="Times New Roman" w:hAnsi="Times New Roman" w:cs="Times New Roman"/>
-                <w:sz w:val="26"/>
-                <w:szCs w:val="26"/>
-              </w:rPr>
-            </w:r>
           </w:p>
         </w:tc>
         <w:tc>
@@ -3572,13 +3048,6 @@
                 <w:szCs w:val="26"/>
               </w:rPr>
             </w:pPr>
-            <w:r>
-              <w:rPr>
-                <w:rFonts w:ascii="Times New Roman" w:hAnsi="Times New Roman" w:cs="Times New Roman"/>
-                <w:sz w:val="26"/>
-                <w:szCs w:val="26"/>
-              </w:rPr>
-            </w:r>
           </w:p>
         </w:tc>
         <w:tc>
@@ -3600,13 +3069,6 @@
                 <w:szCs w:val="26"/>
               </w:rPr>
             </w:pPr>
-            <w:r>
-              <w:rPr>
-                <w:rFonts w:ascii="Times New Roman" w:hAnsi="Times New Roman" w:cs="Times New Roman"/>
-                <w:sz w:val="26"/>
-                <w:szCs w:val="26"/>
-              </w:rPr>
-            </w:r>
           </w:p>
         </w:tc>
         <w:tc>
@@ -3628,13 +3090,6 @@
                 <w:szCs w:val="26"/>
               </w:rPr>
             </w:pPr>
-            <w:r>
-              <w:rPr>
-                <w:rFonts w:ascii="Times New Roman" w:hAnsi="Times New Roman" w:cs="Times New Roman"/>
-                <w:sz w:val="26"/>
-                <w:szCs w:val="26"/>
-              </w:rPr>
-            </w:r>
           </w:p>
         </w:tc>
       </w:tr>
@@ -3714,12 +3169,6 @@
                 <w:szCs w:val="26"/>
               </w:rPr>
             </w:pPr>
-            <w:r>
-              <w:rPr>
-                <w:rFonts w:ascii="Times New Roman" w:hAnsi="Times New Roman"/>
-                <w:sz w:val="26"/>
-              </w:rPr>
-            </w:r>
           </w:p>
         </w:tc>
         <w:tc>
@@ -3741,12 +3190,6 @@
                 <w:szCs w:val="26"/>
               </w:rPr>
             </w:pPr>
-            <w:r>
-              <w:rPr>
-                <w:rFonts w:ascii="Times New Roman" w:hAnsi="Times New Roman"/>
-                <w:sz w:val="26"/>
-              </w:rPr>
-            </w:r>
           </w:p>
         </w:tc>
         <w:tc>
@@ -3768,12 +3211,6 @@
                 <w:szCs w:val="26"/>
               </w:rPr>
             </w:pPr>
-            <w:r>
-              <w:rPr>
-                <w:rFonts w:ascii="Times New Roman" w:hAnsi="Times New Roman"/>
-                <w:sz w:val="26"/>
-              </w:rPr>
-            </w:r>
           </w:p>
         </w:tc>
         <w:tc>
@@ -3795,12 +3232,6 @@
                 <w:szCs w:val="26"/>
               </w:rPr>
             </w:pPr>
-            <w:r>
-              <w:rPr>
-                <w:rFonts w:ascii="Times New Roman" w:hAnsi="Times New Roman"/>
-                <w:sz w:val="26"/>
-              </w:rPr>
-            </w:r>
           </w:p>
         </w:tc>
         <w:tc>
@@ -3822,12 +3253,6 @@
                 <w:szCs w:val="26"/>
               </w:rPr>
             </w:pPr>
-            <w:r>
-              <w:rPr>
-                <w:rFonts w:ascii="Times New Roman" w:hAnsi="Times New Roman"/>
-                <w:sz w:val="26"/>
-              </w:rPr>
-            </w:r>
           </w:p>
         </w:tc>
       </w:tr>
@@ -3907,13 +3332,6 @@
                 <w:szCs w:val="26"/>
               </w:rPr>
             </w:pPr>
-            <w:r>
-              <w:rPr>
-                <w:rFonts w:ascii="Times New Roman" w:hAnsi="Times New Roman" w:cs="Times New Roman"/>
-                <w:sz w:val="26"/>
-                <w:szCs w:val="26"/>
-              </w:rPr>
-            </w:r>
           </w:p>
         </w:tc>
         <w:tc>
@@ -3935,13 +3353,6 @@
                 <w:szCs w:val="26"/>
               </w:rPr>
             </w:pPr>
-            <w:r>
-              <w:rPr>
-                <w:rFonts w:ascii="Times New Roman" w:hAnsi="Times New Roman" w:cs="Times New Roman"/>
-                <w:sz w:val="26"/>
-                <w:szCs w:val="26"/>
-              </w:rPr>
-            </w:r>
           </w:p>
         </w:tc>
         <w:tc>
@@ -3963,13 +3374,6 @@
                 <w:szCs w:val="26"/>
               </w:rPr>
             </w:pPr>
-            <w:r>
-              <w:rPr>
-                <w:rFonts w:ascii="Times New Roman" w:hAnsi="Times New Roman" w:cs="Times New Roman"/>
-                <w:sz w:val="26"/>
-                <w:szCs w:val="26"/>
-              </w:rPr>
-            </w:r>
           </w:p>
         </w:tc>
         <w:tc>
@@ -3991,13 +3395,6 @@
                 <w:szCs w:val="26"/>
               </w:rPr>
             </w:pPr>
-            <w:r>
-              <w:rPr>
-                <w:rFonts w:ascii="Times New Roman" w:hAnsi="Times New Roman" w:cs="Times New Roman"/>
-                <w:sz w:val="26"/>
-                <w:szCs w:val="26"/>
-              </w:rPr>
-            </w:r>
           </w:p>
         </w:tc>
         <w:tc>
@@ -4019,13 +3416,6 @@
                 <w:szCs w:val="26"/>
               </w:rPr>
             </w:pPr>
-            <w:r>
-              <w:rPr>
-                <w:rFonts w:ascii="Times New Roman" w:hAnsi="Times New Roman" w:cs="Times New Roman"/>
-                <w:sz w:val="26"/>
-                <w:szCs w:val="26"/>
-              </w:rPr>
-            </w:r>
           </w:p>
         </w:tc>
       </w:tr>
@@ -4105,12 +3495,6 @@
                 <w:szCs w:val="26"/>
               </w:rPr>
             </w:pPr>
-            <w:r>
-              <w:rPr>
-                <w:rFonts w:ascii="Times New Roman" w:hAnsi="Times New Roman"/>
-                <w:sz w:val="26"/>
-              </w:rPr>
-            </w:r>
           </w:p>
         </w:tc>
         <w:tc>
@@ -4132,12 +3516,6 @@
                 <w:szCs w:val="26"/>
               </w:rPr>
             </w:pPr>
-            <w:r>
-              <w:rPr>
-                <w:rFonts w:ascii="Times New Roman" w:hAnsi="Times New Roman"/>
-                <w:sz w:val="26"/>
-              </w:rPr>
-            </w:r>
           </w:p>
         </w:tc>
         <w:tc>
@@ -4159,12 +3537,6 @@
                 <w:szCs w:val="26"/>
               </w:rPr>
             </w:pPr>
-            <w:r>
-              <w:rPr>
-                <w:rFonts w:ascii="Times New Roman" w:hAnsi="Times New Roman"/>
-                <w:sz w:val="26"/>
-              </w:rPr>
-            </w:r>
           </w:p>
         </w:tc>
         <w:tc>
@@ -4186,12 +3558,6 @@
                 <w:szCs w:val="26"/>
               </w:rPr>
             </w:pPr>
-            <w:r>
-              <w:rPr>
-                <w:rFonts w:ascii="Times New Roman" w:hAnsi="Times New Roman"/>
-                <w:sz w:val="26"/>
-              </w:rPr>
-            </w:r>
           </w:p>
         </w:tc>
         <w:tc>
@@ -4213,12 +3579,6 @@
                 <w:szCs w:val="26"/>
               </w:rPr>
             </w:pPr>
-            <w:r>
-              <w:rPr>
-                <w:rFonts w:ascii="Times New Roman" w:hAnsi="Times New Roman"/>
-                <w:sz w:val="26"/>
-              </w:rPr>
-            </w:r>
           </w:p>
         </w:tc>
       </w:tr>
@@ -4302,12 +3662,6 @@
                 <w:szCs w:val="26"/>
               </w:rPr>
             </w:pPr>
-            <w:r>
-              <w:rPr>
-                <w:rFonts w:ascii="Times New Roman" w:hAnsi="Times New Roman"/>
-                <w:sz w:val="26"/>
-              </w:rPr>
-            </w:r>
           </w:p>
         </w:tc>
         <w:tc>
@@ -4329,12 +3683,6 @@
                 <w:szCs w:val="26"/>
               </w:rPr>
             </w:pPr>
-            <w:r>
-              <w:rPr>
-                <w:rFonts w:ascii="Times New Roman" w:hAnsi="Times New Roman"/>
-                <w:sz w:val="26"/>
-              </w:rPr>
-            </w:r>
           </w:p>
         </w:tc>
         <w:tc>
@@ -4356,12 +3704,6 @@
                 <w:szCs w:val="26"/>
               </w:rPr>
             </w:pPr>
-            <w:r>
-              <w:rPr>
-                <w:rFonts w:ascii="Times New Roman" w:hAnsi="Times New Roman"/>
-                <w:sz w:val="26"/>
-              </w:rPr>
-            </w:r>
           </w:p>
         </w:tc>
         <w:tc>
@@ -4383,12 +3725,6 @@
                 <w:szCs w:val="26"/>
               </w:rPr>
             </w:pPr>
-            <w:r>
-              <w:rPr>
-                <w:rFonts w:ascii="Times New Roman" w:hAnsi="Times New Roman"/>
-                <w:sz w:val="26"/>
-              </w:rPr>
-            </w:r>
           </w:p>
         </w:tc>
         <w:tc>
@@ -4410,12 +3746,6 @@
                 <w:szCs w:val="26"/>
               </w:rPr>
             </w:pPr>
-            <w:r>
-              <w:rPr>
-                <w:rFonts w:ascii="Times New Roman" w:hAnsi="Times New Roman"/>
-                <w:sz w:val="26"/>
-              </w:rPr>
-            </w:r>
           </w:p>
         </w:tc>
       </w:tr>
@@ -4492,13 +3822,6 @@
                 <w:szCs w:val="26"/>
               </w:rPr>
             </w:pPr>
-            <w:r>
-              <w:rPr>
-                <w:rFonts w:ascii="Times New Roman" w:hAnsi="Times New Roman" w:cs="Times New Roman"/>
-                <w:sz w:val="26"/>
-                <w:szCs w:val="26"/>
-              </w:rPr>
-            </w:r>
           </w:p>
         </w:tc>
         <w:tc>
@@ -4520,13 +3843,6 @@
                 <w:szCs w:val="26"/>
               </w:rPr>
             </w:pPr>
-            <w:r>
-              <w:rPr>
-                <w:rFonts w:ascii="Times New Roman" w:hAnsi="Times New Roman" w:cs="Times New Roman"/>
-                <w:sz w:val="26"/>
-                <w:szCs w:val="26"/>
-              </w:rPr>
-            </w:r>
           </w:p>
         </w:tc>
         <w:tc>
@@ -4548,13 +3864,6 @@
                 <w:szCs w:val="26"/>
               </w:rPr>
             </w:pPr>
-            <w:r>
-              <w:rPr>
-                <w:rFonts w:ascii="Times New Roman" w:hAnsi="Times New Roman" w:cs="Times New Roman"/>
-                <w:sz w:val="26"/>
-                <w:szCs w:val="26"/>
-              </w:rPr>
-            </w:r>
           </w:p>
         </w:tc>
         <w:tc>
@@ -4576,13 +3885,6 @@
                 <w:szCs w:val="26"/>
               </w:rPr>
             </w:pPr>
-            <w:r>
-              <w:rPr>
-                <w:rFonts w:ascii="Times New Roman" w:hAnsi="Times New Roman" w:cs="Times New Roman"/>
-                <w:sz w:val="26"/>
-                <w:szCs w:val="26"/>
-              </w:rPr>
-            </w:r>
           </w:p>
         </w:tc>
         <w:tc>
@@ -4604,13 +3906,6 @@
                 <w:szCs w:val="26"/>
               </w:rPr>
             </w:pPr>
-            <w:r>
-              <w:rPr>
-                <w:rFonts w:ascii="Times New Roman" w:hAnsi="Times New Roman" w:cs="Times New Roman"/>
-                <w:sz w:val="26"/>
-                <w:szCs w:val="26"/>
-              </w:rPr>
-            </w:r>
           </w:p>
         </w:tc>
       </w:tr>
@@ -4687,13 +3982,6 @@
                 <w:szCs w:val="26"/>
               </w:rPr>
             </w:pPr>
-            <w:r>
-              <w:rPr>
-                <w:rFonts w:ascii="Times New Roman" w:hAnsi="Times New Roman" w:cs="Times New Roman"/>
-                <w:sz w:val="26"/>
-                <w:szCs w:val="26"/>
-              </w:rPr>
-            </w:r>
           </w:p>
         </w:tc>
         <w:tc>
@@ -4715,13 +4003,6 @@
                 <w:szCs w:val="26"/>
               </w:rPr>
             </w:pPr>
-            <w:r>
-              <w:rPr>
-                <w:rFonts w:ascii="Times New Roman" w:hAnsi="Times New Roman" w:cs="Times New Roman"/>
-                <w:sz w:val="26"/>
-                <w:szCs w:val="26"/>
-              </w:rPr>
-            </w:r>
           </w:p>
         </w:tc>
         <w:tc>
@@ -4743,13 +4024,6 @@
                 <w:szCs w:val="26"/>
               </w:rPr>
             </w:pPr>
-            <w:r>
-              <w:rPr>
-                <w:rFonts w:ascii="Times New Roman" w:hAnsi="Times New Roman" w:cs="Times New Roman"/>
-                <w:sz w:val="26"/>
-                <w:szCs w:val="26"/>
-              </w:rPr>
-            </w:r>
           </w:p>
         </w:tc>
         <w:tc>
@@ -4771,13 +4045,6 @@
                 <w:szCs w:val="26"/>
               </w:rPr>
             </w:pPr>
-            <w:r>
-              <w:rPr>
-                <w:rFonts w:ascii="Times New Roman" w:hAnsi="Times New Roman" w:cs="Times New Roman"/>
-                <w:sz w:val="26"/>
-                <w:szCs w:val="26"/>
-              </w:rPr>
-            </w:r>
           </w:p>
         </w:tc>
         <w:tc>
@@ -4799,13 +4066,6 @@
                 <w:szCs w:val="26"/>
               </w:rPr>
             </w:pPr>
-            <w:r>
-              <w:rPr>
-                <w:rFonts w:ascii="Times New Roman" w:hAnsi="Times New Roman" w:cs="Times New Roman"/>
-                <w:sz w:val="26"/>
-                <w:szCs w:val="26"/>
-              </w:rPr>
-            </w:r>
           </w:p>
         </w:tc>
       </w:tr>
@@ -5175,7 +4435,7 @@
                 <w:sz w:val="26"/>
                 <w:szCs w:val="26"/>
               </w:rPr>
-              <w:t>Đánh giá định kỳ 1</w:t>
+              <w:t>Ôn tập Đánh giá định kỳ 1</w:t>
             </w:r>
           </w:p>
         </w:tc>
@@ -5249,8 +4509,8 @@
         <w:tblLook w:val="04A0" w:firstRow="1" w:lastRow="0" w:firstColumn="1" w:lastColumn="0" w:noHBand="0" w:noVBand="1"/>
       </w:tblPr>
       <w:tblGrid>
-        <w:gridCol w:w="6716"/>
-        <w:gridCol w:w="3294"/>
+        <w:gridCol w:w="6091"/>
+        <w:gridCol w:w="3909"/>
       </w:tblGrid>
       <w:tr>
         <w:tc>
@@ -5265,50 +4525,6 @@
                 <w:szCs w:val="26"/>
               </w:rPr>
             </w:pPr>
-            <w:r>
-              <w:rPr>
-                <w:rFonts w:ascii="Times New Roman" w:hAnsi="Times New Roman" w:cs="Times New Roman"/>
-                <w:sz w:val="26"/>
-                <w:szCs w:val="26"/>
-              </w:rPr>
-              <w:t>Kiểm tra, nhận xét</w:t>
-            </w:r>
-            <w:r>
-              <w:rPr>
-                <w:rFonts w:ascii="Times New Roman" w:hAnsi="Times New Roman" w:cs="Times New Roman"/>
-                <w:sz w:val="26"/>
-                <w:szCs w:val="26"/>
-              </w:rPr>
-              <w:br/>
-              <w:t>…………………………………………………………………</w:t>
-            </w:r>
-            <w:r>
-              <w:rPr>
-                <w:rFonts w:ascii="Times New Roman" w:hAnsi="Times New Roman" w:cs="Times New Roman"/>
-                <w:sz w:val="26"/>
-                <w:szCs w:val="26"/>
-              </w:rPr>
-              <w:br/>
-              <w:t>…………………………………………………………………</w:t>
-            </w:r>
-            <w:r>
-              <w:rPr>
-                <w:rFonts w:ascii="Times New Roman" w:hAnsi="Times New Roman" w:cs="Times New Roman"/>
-                <w:sz w:val="26"/>
-                <w:szCs w:val="26"/>
-              </w:rPr>
-              <w:br/>
-              <w:t>…………………………………………………………………</w:t>
-            </w:r>
-            <w:r>
-              <w:rPr>
-                <w:rFonts w:ascii="Times New Roman" w:hAnsi="Times New Roman" w:cs="Times New Roman"/>
-                <w:sz w:val="26"/>
-                <w:szCs w:val="26"/>
-              </w:rPr>
-              <w:br/>
-              <w:t>…………………………………………………………………</w:t>
-            </w:r>
           </w:p>
         </w:tc>
         <w:tc>
@@ -5324,32 +4540,6 @@
                 <w:szCs w:val="26"/>
               </w:rPr>
             </w:pPr>
-            <w:r>
-              <w:rPr>
-                <w:rFonts w:ascii="Times New Roman" w:hAnsi="Times New Roman"/>
-                <w:sz w:val="26"/>
-              </w:rPr>
-              <w:t>Ngày 25 tháng 9 năm 2026</w:t>
-              <w:br/>
-            </w:r>
-            <w:r>
-              <w:rPr>
-                <w:rFonts w:ascii="Times New Roman" w:hAnsi="Times New Roman"/>
-                <w:sz w:val="26"/>
-              </w:rPr>
-              <w:t>Tổ trưởng</w:t>
-              <w:br/>
-              <w:br/>
-              <w:br/>
-              <w:br/>
-            </w:r>
-            <w:r>
-              <w:rPr>
-                <w:rFonts w:ascii="Times New Roman" w:hAnsi="Times New Roman"/>
-                <w:sz w:val="26"/>
-              </w:rPr>
-              <w:t>Nguyễn Thị Ngọc Ánh</w:t>
-            </w:r>
           </w:p>
         </w:tc>
       </w:tr>
@@ -5370,6 +4560,7 @@
         <w:rPr>
           <w:i/>
         </w:rPr>
+        <w:lastRenderedPageBreak/>
         <w:t>Buổi…chiều…..Tuần…09…(Từ ngày…28/09/2026…đến ngày:… 02/10/2026….)</w:t>
       </w:r>
     </w:p>
@@ -5728,12 +4919,6 @@
                 <w:szCs w:val="26"/>
               </w:rPr>
             </w:pPr>
-            <w:r>
-              <w:rPr>
-                <w:rFonts w:ascii="Times New Roman" w:hAnsi="Times New Roman"/>
-                <w:sz w:val="26"/>
-              </w:rPr>
-            </w:r>
           </w:p>
         </w:tc>
         <w:tc>
@@ -5755,12 +4940,6 @@
                 <w:szCs w:val="26"/>
               </w:rPr>
             </w:pPr>
-            <w:r>
-              <w:rPr>
-                <w:rFonts w:ascii="Times New Roman" w:hAnsi="Times New Roman"/>
-                <w:sz w:val="26"/>
-              </w:rPr>
-            </w:r>
           </w:p>
         </w:tc>
         <w:tc>
@@ -5782,12 +4961,6 @@
                 <w:szCs w:val="26"/>
               </w:rPr>
             </w:pPr>
-            <w:r>
-              <w:rPr>
-                <w:rFonts w:ascii="Times New Roman" w:hAnsi="Times New Roman"/>
-                <w:sz w:val="26"/>
-              </w:rPr>
-            </w:r>
           </w:p>
         </w:tc>
         <w:tc>
@@ -5809,12 +4982,6 @@
                 <w:szCs w:val="26"/>
               </w:rPr>
             </w:pPr>
-            <w:r>
-              <w:rPr>
-                <w:rFonts w:ascii="Times New Roman" w:hAnsi="Times New Roman"/>
-                <w:sz w:val="26"/>
-              </w:rPr>
-            </w:r>
           </w:p>
         </w:tc>
         <w:tc>
@@ -5836,12 +5003,6 @@
                 <w:szCs w:val="26"/>
               </w:rPr>
             </w:pPr>
-            <w:r>
-              <w:rPr>
-                <w:rFonts w:ascii="Times New Roman" w:hAnsi="Times New Roman"/>
-                <w:sz w:val="26"/>
-              </w:rPr>
-            </w:r>
           </w:p>
         </w:tc>
       </w:tr>
@@ -5919,12 +5080,6 @@
                 <w:szCs w:val="26"/>
               </w:rPr>
             </w:pPr>
-            <w:r>
-              <w:rPr>
-                <w:rFonts w:ascii="Times New Roman" w:hAnsi="Times New Roman"/>
-                <w:sz w:val="26"/>
-              </w:rPr>
-            </w:r>
           </w:p>
         </w:tc>
         <w:tc>
@@ -5946,12 +5101,6 @@
                 <w:szCs w:val="26"/>
               </w:rPr>
             </w:pPr>
-            <w:r>
-              <w:rPr>
-                <w:rFonts w:ascii="Times New Roman" w:hAnsi="Times New Roman"/>
-                <w:sz w:val="26"/>
-              </w:rPr>
-            </w:r>
           </w:p>
         </w:tc>
         <w:tc>
@@ -5973,12 +5122,6 @@
                 <w:szCs w:val="26"/>
               </w:rPr>
             </w:pPr>
-            <w:r>
-              <w:rPr>
-                <w:rFonts w:ascii="Times New Roman" w:hAnsi="Times New Roman"/>
-                <w:sz w:val="26"/>
-              </w:rPr>
-            </w:r>
           </w:p>
         </w:tc>
         <w:tc>
@@ -6000,12 +5143,6 @@
                 <w:szCs w:val="26"/>
               </w:rPr>
             </w:pPr>
-            <w:r>
-              <w:rPr>
-                <w:rFonts w:ascii="Times New Roman" w:hAnsi="Times New Roman"/>
-                <w:sz w:val="26"/>
-              </w:rPr>
-            </w:r>
           </w:p>
         </w:tc>
         <w:tc>
@@ -6027,12 +5164,6 @@
                 <w:szCs w:val="26"/>
               </w:rPr>
             </w:pPr>
-            <w:r>
-              <w:rPr>
-                <w:rFonts w:ascii="Times New Roman" w:hAnsi="Times New Roman"/>
-                <w:sz w:val="26"/>
-              </w:rPr>
-            </w:r>
           </w:p>
         </w:tc>
       </w:tr>
@@ -6110,12 +5241,6 @@
                 <w:szCs w:val="26"/>
               </w:rPr>
             </w:pPr>
-            <w:r>
-              <w:rPr>
-                <w:rFonts w:ascii="Times New Roman" w:hAnsi="Times New Roman"/>
-                <w:sz w:val="26"/>
-              </w:rPr>
-            </w:r>
           </w:p>
         </w:tc>
         <w:tc>
@@ -6137,12 +5262,6 @@
                 <w:szCs w:val="26"/>
               </w:rPr>
             </w:pPr>
-            <w:r>
-              <w:rPr>
-                <w:rFonts w:ascii="Times New Roman" w:hAnsi="Times New Roman"/>
-                <w:sz w:val="26"/>
-              </w:rPr>
-            </w:r>
           </w:p>
         </w:tc>
         <w:tc>
@@ -6164,12 +5283,6 @@
                 <w:szCs w:val="26"/>
               </w:rPr>
             </w:pPr>
-            <w:r>
-              <w:rPr>
-                <w:rFonts w:ascii="Times New Roman" w:hAnsi="Times New Roman"/>
-                <w:sz w:val="26"/>
-              </w:rPr>
-            </w:r>
           </w:p>
         </w:tc>
         <w:tc>
@@ -6191,12 +5304,6 @@
                 <w:szCs w:val="26"/>
               </w:rPr>
             </w:pPr>
-            <w:r>
-              <w:rPr>
-                <w:rFonts w:ascii="Times New Roman" w:hAnsi="Times New Roman"/>
-                <w:sz w:val="26"/>
-              </w:rPr>
-            </w:r>
           </w:p>
         </w:tc>
         <w:tc>
@@ -6218,12 +5325,6 @@
                 <w:szCs w:val="26"/>
               </w:rPr>
             </w:pPr>
-            <w:r>
-              <w:rPr>
-                <w:rFonts w:ascii="Times New Roman" w:hAnsi="Times New Roman"/>
-                <w:sz w:val="26"/>
-              </w:rPr>
-            </w:r>
           </w:p>
         </w:tc>
       </w:tr>
@@ -6301,12 +5402,6 @@
                 <w:szCs w:val="26"/>
               </w:rPr>
             </w:pPr>
-            <w:r>
-              <w:rPr>
-                <w:rFonts w:ascii="Times New Roman" w:hAnsi="Times New Roman"/>
-                <w:sz w:val="26"/>
-              </w:rPr>
-            </w:r>
           </w:p>
         </w:tc>
         <w:tc>
@@ -6328,12 +5423,6 @@
                 <w:szCs w:val="26"/>
               </w:rPr>
             </w:pPr>
-            <w:r>
-              <w:rPr>
-                <w:rFonts w:ascii="Times New Roman" w:hAnsi="Times New Roman"/>
-                <w:sz w:val="26"/>
-              </w:rPr>
-            </w:r>
           </w:p>
         </w:tc>
         <w:tc>
@@ -6355,12 +5444,6 @@
                 <w:szCs w:val="26"/>
               </w:rPr>
             </w:pPr>
-            <w:r>
-              <w:rPr>
-                <w:rFonts w:ascii="Times New Roman" w:hAnsi="Times New Roman"/>
-                <w:sz w:val="26"/>
-              </w:rPr>
-            </w:r>
           </w:p>
         </w:tc>
         <w:tc>
@@ -6382,12 +5465,6 @@
                 <w:szCs w:val="26"/>
               </w:rPr>
             </w:pPr>
-            <w:r>
-              <w:rPr>
-                <w:rFonts w:ascii="Times New Roman" w:hAnsi="Times New Roman"/>
-                <w:sz w:val="26"/>
-              </w:rPr>
-            </w:r>
           </w:p>
         </w:tc>
         <w:tc>
@@ -6409,12 +5486,6 @@
                 <w:szCs w:val="26"/>
               </w:rPr>
             </w:pPr>
-            <w:r>
-              <w:rPr>
-                <w:rFonts w:ascii="Times New Roman" w:hAnsi="Times New Roman"/>
-                <w:sz w:val="26"/>
-              </w:rPr>
-            </w:r>
           </w:p>
         </w:tc>
       </w:tr>
@@ -6492,12 +5563,6 @@
                 <w:szCs w:val="26"/>
               </w:rPr>
             </w:pPr>
-            <w:r>
-              <w:rPr>
-                <w:rFonts w:ascii="Times New Roman" w:hAnsi="Times New Roman"/>
-                <w:sz w:val="26"/>
-              </w:rPr>
-            </w:r>
           </w:p>
         </w:tc>
         <w:tc>
@@ -6519,12 +5584,6 @@
                 <w:szCs w:val="26"/>
               </w:rPr>
             </w:pPr>
-            <w:r>
-              <w:rPr>
-                <w:rFonts w:ascii="Times New Roman" w:hAnsi="Times New Roman"/>
-                <w:sz w:val="26"/>
-              </w:rPr>
-            </w:r>
           </w:p>
         </w:tc>
         <w:tc>
@@ -6546,12 +5605,6 @@
                 <w:szCs w:val="26"/>
               </w:rPr>
             </w:pPr>
-            <w:r>
-              <w:rPr>
-                <w:rFonts w:ascii="Times New Roman" w:hAnsi="Times New Roman"/>
-                <w:sz w:val="26"/>
-              </w:rPr>
-            </w:r>
           </w:p>
         </w:tc>
         <w:tc>
@@ -6573,12 +5626,6 @@
                 <w:szCs w:val="26"/>
               </w:rPr>
             </w:pPr>
-            <w:r>
-              <w:rPr>
-                <w:rFonts w:ascii="Times New Roman" w:hAnsi="Times New Roman"/>
-                <w:sz w:val="26"/>
-              </w:rPr>
-            </w:r>
           </w:p>
         </w:tc>
         <w:tc>
@@ -6600,12 +5647,6 @@
                 <w:szCs w:val="26"/>
               </w:rPr>
             </w:pPr>
-            <w:r>
-              <w:rPr>
-                <w:rFonts w:ascii="Times New Roman" w:hAnsi="Times New Roman"/>
-                <w:sz w:val="26"/>
-              </w:rPr>
-            </w:r>
           </w:p>
         </w:tc>
       </w:tr>
@@ -6689,13 +5730,6 @@
                 <w:szCs w:val="26"/>
               </w:rPr>
             </w:pPr>
-            <w:r>
-              <w:rPr>
-                <w:rFonts w:ascii="Times New Roman" w:hAnsi="Times New Roman" w:cs="Times New Roman"/>
-                <w:sz w:val="26"/>
-                <w:szCs w:val="26"/>
-              </w:rPr>
-            </w:r>
           </w:p>
         </w:tc>
         <w:tc>
@@ -6717,13 +5751,6 @@
                 <w:szCs w:val="26"/>
               </w:rPr>
             </w:pPr>
-            <w:r>
-              <w:rPr>
-                <w:rFonts w:ascii="Times New Roman" w:hAnsi="Times New Roman" w:cs="Times New Roman"/>
-                <w:sz w:val="26"/>
-                <w:szCs w:val="26"/>
-              </w:rPr>
-            </w:r>
           </w:p>
         </w:tc>
         <w:tc>
@@ -6745,13 +5772,6 @@
                 <w:szCs w:val="26"/>
               </w:rPr>
             </w:pPr>
-            <w:r>
-              <w:rPr>
-                <w:rFonts w:ascii="Times New Roman" w:hAnsi="Times New Roman" w:cs="Times New Roman"/>
-                <w:sz w:val="26"/>
-                <w:szCs w:val="26"/>
-              </w:rPr>
-            </w:r>
           </w:p>
         </w:tc>
         <w:tc>
@@ -6773,13 +5793,6 @@
                 <w:szCs w:val="26"/>
               </w:rPr>
             </w:pPr>
-            <w:r>
-              <w:rPr>
-                <w:rFonts w:ascii="Times New Roman" w:hAnsi="Times New Roman" w:cs="Times New Roman"/>
-                <w:sz w:val="26"/>
-                <w:szCs w:val="26"/>
-              </w:rPr>
-            </w:r>
           </w:p>
         </w:tc>
         <w:tc>
@@ -6801,13 +5814,6 @@
                 <w:szCs w:val="26"/>
               </w:rPr>
             </w:pPr>
-            <w:r>
-              <w:rPr>
-                <w:rFonts w:ascii="Times New Roman" w:hAnsi="Times New Roman" w:cs="Times New Roman"/>
-                <w:sz w:val="26"/>
-                <w:szCs w:val="26"/>
-              </w:rPr>
-            </w:r>
           </w:p>
         </w:tc>
       </w:tr>
@@ -6887,13 +5893,6 @@
                 <w:szCs w:val="26"/>
               </w:rPr>
             </w:pPr>
-            <w:r>
-              <w:rPr>
-                <w:rFonts w:ascii="Times New Roman" w:hAnsi="Times New Roman" w:cs="Times New Roman"/>
-                <w:sz w:val="26"/>
-                <w:szCs w:val="26"/>
-              </w:rPr>
-            </w:r>
           </w:p>
         </w:tc>
         <w:tc>
@@ -6915,13 +5914,6 @@
                 <w:szCs w:val="26"/>
               </w:rPr>
             </w:pPr>
-            <w:r>
-              <w:rPr>
-                <w:rFonts w:ascii="Times New Roman" w:hAnsi="Times New Roman" w:cs="Times New Roman"/>
-                <w:sz w:val="26"/>
-                <w:szCs w:val="26"/>
-              </w:rPr>
-            </w:r>
           </w:p>
         </w:tc>
         <w:tc>
@@ -6943,13 +5935,6 @@
                 <w:szCs w:val="26"/>
               </w:rPr>
             </w:pPr>
-            <w:r>
-              <w:rPr>
-                <w:rFonts w:ascii="Times New Roman" w:hAnsi="Times New Roman" w:cs="Times New Roman"/>
-                <w:sz w:val="26"/>
-                <w:szCs w:val="26"/>
-              </w:rPr>
-            </w:r>
           </w:p>
         </w:tc>
         <w:tc>
@@ -6971,13 +5956,6 @@
                 <w:szCs w:val="26"/>
               </w:rPr>
             </w:pPr>
-            <w:r>
-              <w:rPr>
-                <w:rFonts w:ascii="Times New Roman" w:hAnsi="Times New Roman" w:cs="Times New Roman"/>
-                <w:sz w:val="26"/>
-                <w:szCs w:val="26"/>
-              </w:rPr>
-            </w:r>
           </w:p>
         </w:tc>
         <w:tc>
@@ -6999,13 +5977,6 @@
                 <w:szCs w:val="26"/>
               </w:rPr>
             </w:pPr>
-            <w:r>
-              <w:rPr>
-                <w:rFonts w:ascii="Times New Roman" w:hAnsi="Times New Roman" w:cs="Times New Roman"/>
-                <w:sz w:val="26"/>
-                <w:szCs w:val="26"/>
-              </w:rPr>
-            </w:r>
           </w:p>
         </w:tc>
       </w:tr>
@@ -7381,7 +6352,7 @@
                 <w:sz w:val="26"/>
                 <w:szCs w:val="26"/>
               </w:rPr>
-              <w:t>Đánh giá định kỳ 1</w:t>
+              <w:t>Ôn tập Đánh giá định kỳ 1</w:t>
             </w:r>
           </w:p>
         </w:tc>
@@ -7491,12 +6462,6 @@
                 <w:szCs w:val="26"/>
               </w:rPr>
             </w:pPr>
-            <w:r>
-              <w:rPr>
-                <w:rFonts w:ascii="Times New Roman" w:hAnsi="Times New Roman"/>
-                <w:sz w:val="26"/>
-              </w:rPr>
-            </w:r>
           </w:p>
         </w:tc>
         <w:tc>
@@ -7518,12 +6483,6 @@
                 <w:szCs w:val="26"/>
               </w:rPr>
             </w:pPr>
-            <w:r>
-              <w:rPr>
-                <w:rFonts w:ascii="Times New Roman" w:hAnsi="Times New Roman"/>
-                <w:sz w:val="26"/>
-              </w:rPr>
-            </w:r>
           </w:p>
         </w:tc>
         <w:tc>
@@ -7545,12 +6504,6 @@
                 <w:szCs w:val="26"/>
               </w:rPr>
             </w:pPr>
-            <w:r>
-              <w:rPr>
-                <w:rFonts w:ascii="Times New Roman" w:hAnsi="Times New Roman"/>
-                <w:sz w:val="26"/>
-              </w:rPr>
-            </w:r>
           </w:p>
         </w:tc>
         <w:tc>
@@ -7572,12 +6525,6 @@
                 <w:szCs w:val="26"/>
               </w:rPr>
             </w:pPr>
-            <w:r>
-              <w:rPr>
-                <w:rFonts w:ascii="Times New Roman" w:hAnsi="Times New Roman"/>
-                <w:sz w:val="26"/>
-              </w:rPr>
-            </w:r>
           </w:p>
         </w:tc>
         <w:tc>
@@ -7599,12 +6546,6 @@
                 <w:szCs w:val="26"/>
               </w:rPr>
             </w:pPr>
-            <w:r>
-              <w:rPr>
-                <w:rFonts w:ascii="Times New Roman" w:hAnsi="Times New Roman"/>
-                <w:sz w:val="26"/>
-              </w:rPr>
-            </w:r>
           </w:p>
         </w:tc>
       </w:tr>
@@ -7688,12 +6629,6 @@
                 <w:szCs w:val="26"/>
               </w:rPr>
             </w:pPr>
-            <w:r>
-              <w:rPr>
-                <w:rFonts w:ascii="Times New Roman" w:hAnsi="Times New Roman"/>
-                <w:sz w:val="26"/>
-              </w:rPr>
-            </w:r>
           </w:p>
         </w:tc>
         <w:tc>
@@ -7715,12 +6650,6 @@
                 <w:szCs w:val="26"/>
               </w:rPr>
             </w:pPr>
-            <w:r>
-              <w:rPr>
-                <w:rFonts w:ascii="Times New Roman" w:hAnsi="Times New Roman"/>
-                <w:sz w:val="26"/>
-              </w:rPr>
-            </w:r>
           </w:p>
         </w:tc>
         <w:tc>
@@ -7742,12 +6671,6 @@
                 <w:szCs w:val="26"/>
               </w:rPr>
             </w:pPr>
-            <w:r>
-              <w:rPr>
-                <w:rFonts w:ascii="Times New Roman" w:hAnsi="Times New Roman"/>
-                <w:sz w:val="26"/>
-              </w:rPr>
-            </w:r>
           </w:p>
         </w:tc>
         <w:tc>
@@ -7769,12 +6692,6 @@
                 <w:szCs w:val="26"/>
               </w:rPr>
             </w:pPr>
-            <w:r>
-              <w:rPr>
-                <w:rFonts w:ascii="Times New Roman" w:hAnsi="Times New Roman"/>
-                <w:sz w:val="26"/>
-              </w:rPr>
-            </w:r>
           </w:p>
         </w:tc>
         <w:tc>
@@ -7796,12 +6713,6 @@
                 <w:szCs w:val="26"/>
               </w:rPr>
             </w:pPr>
-            <w:r>
-              <w:rPr>
-                <w:rFonts w:ascii="Times New Roman" w:hAnsi="Times New Roman"/>
-                <w:sz w:val="26"/>
-              </w:rPr>
-            </w:r>
           </w:p>
         </w:tc>
       </w:tr>
@@ -7881,12 +6792,6 @@
                 <w:szCs w:val="26"/>
               </w:rPr>
             </w:pPr>
-            <w:r>
-              <w:rPr>
-                <w:rFonts w:ascii="Times New Roman" w:hAnsi="Times New Roman"/>
-                <w:sz w:val="26"/>
-              </w:rPr>
-            </w:r>
           </w:p>
         </w:tc>
         <w:tc>
@@ -7908,12 +6813,6 @@
                 <w:szCs w:val="26"/>
               </w:rPr>
             </w:pPr>
-            <w:r>
-              <w:rPr>
-                <w:rFonts w:ascii="Times New Roman" w:hAnsi="Times New Roman"/>
-                <w:sz w:val="26"/>
-              </w:rPr>
-            </w:r>
           </w:p>
         </w:tc>
         <w:tc>
@@ -7935,12 +6834,6 @@
                 <w:szCs w:val="26"/>
               </w:rPr>
             </w:pPr>
-            <w:r>
-              <w:rPr>
-                <w:rFonts w:ascii="Times New Roman" w:hAnsi="Times New Roman"/>
-                <w:sz w:val="26"/>
-              </w:rPr>
-            </w:r>
           </w:p>
         </w:tc>
         <w:tc>
@@ -7962,12 +6855,6 @@
                 <w:szCs w:val="26"/>
               </w:rPr>
             </w:pPr>
-            <w:r>
-              <w:rPr>
-                <w:rFonts w:ascii="Times New Roman" w:hAnsi="Times New Roman"/>
-                <w:sz w:val="26"/>
-              </w:rPr>
-            </w:r>
           </w:p>
         </w:tc>
         <w:tc>
@@ -7989,12 +6876,6 @@
                 <w:szCs w:val="26"/>
               </w:rPr>
             </w:pPr>
-            <w:r>
-              <w:rPr>
-                <w:rFonts w:ascii="Times New Roman" w:hAnsi="Times New Roman"/>
-                <w:sz w:val="26"/>
-              </w:rPr>
-            </w:r>
           </w:p>
         </w:tc>
       </w:tr>
@@ -8074,13 +6955,6 @@
                 <w:szCs w:val="26"/>
               </w:rPr>
             </w:pPr>
-            <w:r>
-              <w:rPr>
-                <w:rFonts w:ascii="Times New Roman" w:hAnsi="Times New Roman" w:cs="Times New Roman"/>
-                <w:sz w:val="26"/>
-                <w:szCs w:val="26"/>
-              </w:rPr>
-            </w:r>
           </w:p>
         </w:tc>
         <w:tc>
@@ -8102,13 +6976,6 @@
                 <w:szCs w:val="26"/>
               </w:rPr>
             </w:pPr>
-            <w:r>
-              <w:rPr>
-                <w:rFonts w:ascii="Times New Roman" w:hAnsi="Times New Roman" w:cs="Times New Roman"/>
-                <w:sz w:val="26"/>
-                <w:szCs w:val="26"/>
-              </w:rPr>
-            </w:r>
           </w:p>
         </w:tc>
         <w:tc>
@@ -8130,13 +6997,6 @@
                 <w:szCs w:val="26"/>
               </w:rPr>
             </w:pPr>
-            <w:r>
-              <w:rPr>
-                <w:rFonts w:ascii="Times New Roman" w:hAnsi="Times New Roman" w:cs="Times New Roman"/>
-                <w:sz w:val="26"/>
-                <w:szCs w:val="26"/>
-              </w:rPr>
-            </w:r>
           </w:p>
         </w:tc>
         <w:tc>
@@ -8158,13 +7018,6 @@
                 <w:szCs w:val="26"/>
               </w:rPr>
             </w:pPr>
-            <w:r>
-              <w:rPr>
-                <w:rFonts w:ascii="Times New Roman" w:hAnsi="Times New Roman" w:cs="Times New Roman"/>
-                <w:sz w:val="26"/>
-                <w:szCs w:val="26"/>
-              </w:rPr>
-            </w:r>
           </w:p>
         </w:tc>
         <w:tc>
@@ -8186,13 +7039,6 @@
                 <w:szCs w:val="26"/>
               </w:rPr>
             </w:pPr>
-            <w:r>
-              <w:rPr>
-                <w:rFonts w:ascii="Times New Roman" w:hAnsi="Times New Roman" w:cs="Times New Roman"/>
-                <w:sz w:val="26"/>
-                <w:szCs w:val="26"/>
-              </w:rPr>
-            </w:r>
           </w:p>
         </w:tc>
       </w:tr>
@@ -8272,13 +7118,6 @@
                 <w:szCs w:val="26"/>
               </w:rPr>
             </w:pPr>
-            <w:r>
-              <w:rPr>
-                <w:rFonts w:ascii="Times New Roman" w:hAnsi="Times New Roman" w:cs="Times New Roman"/>
-                <w:sz w:val="26"/>
-                <w:szCs w:val="26"/>
-              </w:rPr>
-            </w:r>
           </w:p>
         </w:tc>
         <w:tc>
@@ -8300,13 +7139,6 @@
                 <w:szCs w:val="26"/>
               </w:rPr>
             </w:pPr>
-            <w:r>
-              <w:rPr>
-                <w:rFonts w:ascii="Times New Roman" w:hAnsi="Times New Roman" w:cs="Times New Roman"/>
-                <w:sz w:val="26"/>
-                <w:szCs w:val="26"/>
-              </w:rPr>
-            </w:r>
           </w:p>
         </w:tc>
         <w:tc>
@@ -8328,13 +7160,6 @@
                 <w:szCs w:val="26"/>
               </w:rPr>
             </w:pPr>
-            <w:r>
-              <w:rPr>
-                <w:rFonts w:ascii="Times New Roman" w:hAnsi="Times New Roman" w:cs="Times New Roman"/>
-                <w:sz w:val="26"/>
-                <w:szCs w:val="26"/>
-              </w:rPr>
-            </w:r>
           </w:p>
         </w:tc>
         <w:tc>
@@ -8356,13 +7181,6 @@
                 <w:szCs w:val="26"/>
               </w:rPr>
             </w:pPr>
-            <w:r>
-              <w:rPr>
-                <w:rFonts w:ascii="Times New Roman" w:hAnsi="Times New Roman" w:cs="Times New Roman"/>
-                <w:sz w:val="26"/>
-                <w:szCs w:val="26"/>
-              </w:rPr>
-            </w:r>
           </w:p>
         </w:tc>
         <w:tc>
@@ -8384,13 +7202,6 @@
                 <w:szCs w:val="26"/>
               </w:rPr>
             </w:pPr>
-            <w:r>
-              <w:rPr>
-                <w:rFonts w:ascii="Times New Roman" w:hAnsi="Times New Roman" w:cs="Times New Roman"/>
-                <w:sz w:val="26"/>
-                <w:szCs w:val="26"/>
-              </w:rPr>
-            </w:r>
           </w:p>
         </w:tc>
       </w:tr>
@@ -8470,12 +7281,6 @@
                 <w:szCs w:val="26"/>
               </w:rPr>
             </w:pPr>
-            <w:r>
-              <w:rPr>
-                <w:rFonts w:ascii="Times New Roman" w:hAnsi="Times New Roman"/>
-                <w:sz w:val="26"/>
-              </w:rPr>
-            </w:r>
           </w:p>
         </w:tc>
         <w:tc>
@@ -8497,12 +7302,6 @@
                 <w:szCs w:val="26"/>
               </w:rPr>
             </w:pPr>
-            <w:r>
-              <w:rPr>
-                <w:rFonts w:ascii="Times New Roman" w:hAnsi="Times New Roman"/>
-                <w:sz w:val="26"/>
-              </w:rPr>
-            </w:r>
           </w:p>
         </w:tc>
         <w:tc>
@@ -8524,12 +7323,6 @@
                 <w:szCs w:val="26"/>
               </w:rPr>
             </w:pPr>
-            <w:r>
-              <w:rPr>
-                <w:rFonts w:ascii="Times New Roman" w:hAnsi="Times New Roman"/>
-                <w:sz w:val="26"/>
-              </w:rPr>
-            </w:r>
           </w:p>
         </w:tc>
         <w:tc>
@@ -8551,12 +7344,6 @@
                 <w:szCs w:val="26"/>
               </w:rPr>
             </w:pPr>
-            <w:r>
-              <w:rPr>
-                <w:rFonts w:ascii="Times New Roman" w:hAnsi="Times New Roman"/>
-                <w:sz w:val="26"/>
-              </w:rPr>
-            </w:r>
           </w:p>
         </w:tc>
         <w:tc>
@@ -8578,12 +7365,6 @@
                 <w:szCs w:val="26"/>
               </w:rPr>
             </w:pPr>
-            <w:r>
-              <w:rPr>
-                <w:rFonts w:ascii="Times New Roman" w:hAnsi="Times New Roman"/>
-                <w:sz w:val="26"/>
-              </w:rPr>
-            </w:r>
           </w:p>
         </w:tc>
       </w:tr>
@@ -8667,13 +7448,6 @@
                 <w:szCs w:val="26"/>
               </w:rPr>
             </w:pPr>
-            <w:r>
-              <w:rPr>
-                <w:rFonts w:ascii="Times New Roman" w:hAnsi="Times New Roman" w:cs="Times New Roman"/>
-                <w:sz w:val="26"/>
-                <w:szCs w:val="26"/>
-              </w:rPr>
-            </w:r>
           </w:p>
         </w:tc>
         <w:tc>
@@ -8695,13 +7469,6 @@
                 <w:szCs w:val="26"/>
               </w:rPr>
             </w:pPr>
-            <w:r>
-              <w:rPr>
-                <w:rFonts w:ascii="Times New Roman" w:hAnsi="Times New Roman" w:cs="Times New Roman"/>
-                <w:sz w:val="26"/>
-                <w:szCs w:val="26"/>
-              </w:rPr>
-            </w:r>
           </w:p>
         </w:tc>
         <w:tc>
@@ -8723,13 +7490,6 @@
                 <w:szCs w:val="26"/>
               </w:rPr>
             </w:pPr>
-            <w:r>
-              <w:rPr>
-                <w:rFonts w:ascii="Times New Roman" w:hAnsi="Times New Roman" w:cs="Times New Roman"/>
-                <w:sz w:val="26"/>
-                <w:szCs w:val="26"/>
-              </w:rPr>
-            </w:r>
           </w:p>
         </w:tc>
         <w:tc>
@@ -8751,13 +7511,6 @@
                 <w:szCs w:val="26"/>
               </w:rPr>
             </w:pPr>
-            <w:r>
-              <w:rPr>
-                <w:rFonts w:ascii="Times New Roman" w:hAnsi="Times New Roman" w:cs="Times New Roman"/>
-                <w:sz w:val="26"/>
-                <w:szCs w:val="26"/>
-              </w:rPr>
-            </w:r>
           </w:p>
         </w:tc>
         <w:tc>
@@ -8779,13 +7532,6 @@
                 <w:szCs w:val="26"/>
               </w:rPr>
             </w:pPr>
-            <w:r>
-              <w:rPr>
-                <w:rFonts w:ascii="Times New Roman" w:hAnsi="Times New Roman" w:cs="Times New Roman"/>
-                <w:sz w:val="26"/>
-                <w:szCs w:val="26"/>
-              </w:rPr>
-            </w:r>
           </w:p>
         </w:tc>
       </w:tr>
@@ -8865,13 +7611,6 @@
                 <w:szCs w:val="26"/>
               </w:rPr>
             </w:pPr>
-            <w:r>
-              <w:rPr>
-                <w:rFonts w:ascii="Times New Roman" w:hAnsi="Times New Roman" w:cs="Times New Roman"/>
-                <w:sz w:val="26"/>
-                <w:szCs w:val="26"/>
-              </w:rPr>
-            </w:r>
           </w:p>
         </w:tc>
         <w:tc>
@@ -8893,13 +7632,6 @@
                 <w:szCs w:val="26"/>
               </w:rPr>
             </w:pPr>
-            <w:r>
-              <w:rPr>
-                <w:rFonts w:ascii="Times New Roman" w:hAnsi="Times New Roman" w:cs="Times New Roman"/>
-                <w:sz w:val="26"/>
-                <w:szCs w:val="26"/>
-              </w:rPr>
-            </w:r>
           </w:p>
         </w:tc>
         <w:tc>
@@ -8921,13 +7653,6 @@
                 <w:szCs w:val="26"/>
               </w:rPr>
             </w:pPr>
-            <w:r>
-              <w:rPr>
-                <w:rFonts w:ascii="Times New Roman" w:hAnsi="Times New Roman" w:cs="Times New Roman"/>
-                <w:sz w:val="26"/>
-                <w:szCs w:val="26"/>
-              </w:rPr>
-            </w:r>
           </w:p>
         </w:tc>
         <w:tc>
@@ -8949,13 +7674,6 @@
                 <w:szCs w:val="26"/>
               </w:rPr>
             </w:pPr>
-            <w:r>
-              <w:rPr>
-                <w:rFonts w:ascii="Times New Roman" w:hAnsi="Times New Roman" w:cs="Times New Roman"/>
-                <w:sz w:val="26"/>
-                <w:szCs w:val="26"/>
-              </w:rPr>
-            </w:r>
           </w:p>
         </w:tc>
         <w:tc>
@@ -8977,13 +7695,6 @@
                 <w:szCs w:val="26"/>
               </w:rPr>
             </w:pPr>
-            <w:r>
-              <w:rPr>
-                <w:rFonts w:ascii="Times New Roman" w:hAnsi="Times New Roman" w:cs="Times New Roman"/>
-                <w:sz w:val="26"/>
-                <w:szCs w:val="26"/>
-              </w:rPr>
-            </w:r>
           </w:p>
         </w:tc>
       </w:tr>
@@ -9063,13 +7774,6 @@
                 <w:szCs w:val="26"/>
               </w:rPr>
             </w:pPr>
-            <w:r>
-              <w:rPr>
-                <w:rFonts w:ascii="Times New Roman" w:hAnsi="Times New Roman" w:cs="Times New Roman"/>
-                <w:sz w:val="26"/>
-                <w:szCs w:val="26"/>
-              </w:rPr>
-            </w:r>
           </w:p>
         </w:tc>
         <w:tc>
@@ -9091,13 +7795,6 @@
                 <w:szCs w:val="26"/>
               </w:rPr>
             </w:pPr>
-            <w:r>
-              <w:rPr>
-                <w:rFonts w:ascii="Times New Roman" w:hAnsi="Times New Roman" w:cs="Times New Roman"/>
-                <w:sz w:val="26"/>
-                <w:szCs w:val="26"/>
-              </w:rPr>
-            </w:r>
           </w:p>
         </w:tc>
         <w:tc>
@@ -9119,13 +7816,6 @@
                 <w:szCs w:val="26"/>
               </w:rPr>
             </w:pPr>
-            <w:r>
-              <w:rPr>
-                <w:rFonts w:ascii="Times New Roman" w:hAnsi="Times New Roman" w:cs="Times New Roman"/>
-                <w:sz w:val="26"/>
-                <w:szCs w:val="26"/>
-              </w:rPr>
-            </w:r>
           </w:p>
         </w:tc>
         <w:tc>
@@ -9147,13 +7837,6 @@
                 <w:szCs w:val="26"/>
               </w:rPr>
             </w:pPr>
-            <w:r>
-              <w:rPr>
-                <w:rFonts w:ascii="Times New Roman" w:hAnsi="Times New Roman" w:cs="Times New Roman"/>
-                <w:sz w:val="26"/>
-                <w:szCs w:val="26"/>
-              </w:rPr>
-            </w:r>
           </w:p>
         </w:tc>
         <w:tc>
@@ -9175,13 +7858,6 @@
                 <w:szCs w:val="26"/>
               </w:rPr>
             </w:pPr>
-            <w:r>
-              <w:rPr>
-                <w:rFonts w:ascii="Times New Roman" w:hAnsi="Times New Roman" w:cs="Times New Roman"/>
-                <w:sz w:val="26"/>
-                <w:szCs w:val="26"/>
-              </w:rPr>
-            </w:r>
           </w:p>
         </w:tc>
       </w:tr>
@@ -9261,13 +7937,6 @@
                 <w:szCs w:val="26"/>
               </w:rPr>
             </w:pPr>
-            <w:r>
-              <w:rPr>
-                <w:rFonts w:ascii="Times New Roman" w:hAnsi="Times New Roman" w:cs="Times New Roman"/>
-                <w:sz w:val="26"/>
-                <w:szCs w:val="26"/>
-              </w:rPr>
-            </w:r>
           </w:p>
         </w:tc>
         <w:tc>
@@ -9289,13 +7958,6 @@
                 <w:szCs w:val="26"/>
               </w:rPr>
             </w:pPr>
-            <w:r>
-              <w:rPr>
-                <w:rFonts w:ascii="Times New Roman" w:hAnsi="Times New Roman" w:cs="Times New Roman"/>
-                <w:sz w:val="26"/>
-                <w:szCs w:val="26"/>
-              </w:rPr>
-            </w:r>
           </w:p>
         </w:tc>
         <w:tc>
@@ -9317,13 +7979,6 @@
                 <w:szCs w:val="26"/>
               </w:rPr>
             </w:pPr>
-            <w:r>
-              <w:rPr>
-                <w:rFonts w:ascii="Times New Roman" w:hAnsi="Times New Roman" w:cs="Times New Roman"/>
-                <w:sz w:val="26"/>
-                <w:szCs w:val="26"/>
-              </w:rPr>
-            </w:r>
           </w:p>
         </w:tc>
         <w:tc>
@@ -9345,13 +8000,6 @@
                 <w:szCs w:val="26"/>
               </w:rPr>
             </w:pPr>
-            <w:r>
-              <w:rPr>
-                <w:rFonts w:ascii="Times New Roman" w:hAnsi="Times New Roman" w:cs="Times New Roman"/>
-                <w:sz w:val="26"/>
-                <w:szCs w:val="26"/>
-              </w:rPr>
-            </w:r>
           </w:p>
         </w:tc>
         <w:tc>
@@ -9373,13 +8021,6 @@
                 <w:szCs w:val="26"/>
               </w:rPr>
             </w:pPr>
-            <w:r>
-              <w:rPr>
-                <w:rFonts w:ascii="Times New Roman" w:hAnsi="Times New Roman" w:cs="Times New Roman"/>
-                <w:sz w:val="26"/>
-                <w:szCs w:val="26"/>
-              </w:rPr>
-            </w:r>
           </w:p>
         </w:tc>
       </w:tr>
@@ -9459,12 +8100,6 @@
                 <w:szCs w:val="26"/>
               </w:rPr>
             </w:pPr>
-            <w:r>
-              <w:rPr>
-                <w:rFonts w:ascii="Times New Roman" w:hAnsi="Times New Roman"/>
-                <w:sz w:val="26"/>
-              </w:rPr>
-            </w:r>
           </w:p>
         </w:tc>
         <w:tc>
@@ -9486,12 +8121,6 @@
                 <w:szCs w:val="26"/>
               </w:rPr>
             </w:pPr>
-            <w:r>
-              <w:rPr>
-                <w:rFonts w:ascii="Times New Roman" w:hAnsi="Times New Roman"/>
-                <w:sz w:val="26"/>
-              </w:rPr>
-            </w:r>
           </w:p>
         </w:tc>
         <w:tc>
@@ -9513,12 +8142,6 @@
                 <w:szCs w:val="26"/>
               </w:rPr>
             </w:pPr>
-            <w:r>
-              <w:rPr>
-                <w:rFonts w:ascii="Times New Roman" w:hAnsi="Times New Roman"/>
-                <w:sz w:val="26"/>
-              </w:rPr>
-            </w:r>
           </w:p>
         </w:tc>
         <w:tc>
@@ -9540,12 +8163,6 @@
                 <w:szCs w:val="26"/>
               </w:rPr>
             </w:pPr>
-            <w:r>
-              <w:rPr>
-                <w:rFonts w:ascii="Times New Roman" w:hAnsi="Times New Roman"/>
-                <w:sz w:val="26"/>
-              </w:rPr>
-            </w:r>
           </w:p>
         </w:tc>
         <w:tc>
@@ -9567,12 +8184,6 @@
                 <w:szCs w:val="26"/>
               </w:rPr>
             </w:pPr>
-            <w:r>
-              <w:rPr>
-                <w:rFonts w:ascii="Times New Roman" w:hAnsi="Times New Roman"/>
-                <w:sz w:val="26"/>
-              </w:rPr>
-            </w:r>
           </w:p>
         </w:tc>
       </w:tr>
@@ -9949,7 +8560,7 @@
                 <w:sz w:val="26"/>
                 <w:szCs w:val="26"/>
               </w:rPr>
-              <w:t>Đánh giá định kỳ 1</w:t>
+              <w:t>Ôn tập Đánh giá định kỳ 1</w:t>
             </w:r>
           </w:p>
         </w:tc>
@@ -10056,13 +8667,6 @@
                 <w:szCs w:val="26"/>
               </w:rPr>
             </w:pPr>
-            <w:r>
-              <w:rPr>
-                <w:rFonts w:ascii="Times New Roman" w:hAnsi="Times New Roman" w:cs="Times New Roman"/>
-                <w:sz w:val="26"/>
-                <w:szCs w:val="26"/>
-              </w:rPr>
-            </w:r>
           </w:p>
         </w:tc>
         <w:tc>
@@ -10084,13 +8688,6 @@
                 <w:szCs w:val="26"/>
               </w:rPr>
             </w:pPr>
-            <w:r>
-              <w:rPr>
-                <w:rFonts w:ascii="Times New Roman" w:hAnsi="Times New Roman" w:cs="Times New Roman"/>
-                <w:sz w:val="26"/>
-                <w:szCs w:val="26"/>
-              </w:rPr>
-            </w:r>
           </w:p>
         </w:tc>
         <w:tc>
@@ -10112,13 +8709,6 @@
                 <w:szCs w:val="26"/>
               </w:rPr>
             </w:pPr>
-            <w:r>
-              <w:rPr>
-                <w:rFonts w:ascii="Times New Roman" w:hAnsi="Times New Roman" w:cs="Times New Roman"/>
-                <w:sz w:val="26"/>
-                <w:szCs w:val="26"/>
-              </w:rPr>
-            </w:r>
           </w:p>
         </w:tc>
         <w:tc>
@@ -10140,13 +8730,6 @@
                 <w:szCs w:val="26"/>
               </w:rPr>
             </w:pPr>
-            <w:r>
-              <w:rPr>
-                <w:rFonts w:ascii="Times New Roman" w:hAnsi="Times New Roman" w:cs="Times New Roman"/>
-                <w:sz w:val="26"/>
-                <w:szCs w:val="26"/>
-              </w:rPr>
-            </w:r>
           </w:p>
         </w:tc>
         <w:tc>
@@ -10168,13 +8751,6 @@
                 <w:szCs w:val="26"/>
               </w:rPr>
             </w:pPr>
-            <w:r>
-              <w:rPr>
-                <w:rFonts w:ascii="Times New Roman" w:hAnsi="Times New Roman" w:cs="Times New Roman"/>
-                <w:sz w:val="26"/>
-                <w:szCs w:val="26"/>
-              </w:rPr>
-            </w:r>
           </w:p>
         </w:tc>
       </w:tr>
@@ -10251,12 +8827,6 @@
                 <w:szCs w:val="26"/>
               </w:rPr>
             </w:pPr>
-            <w:r>
-              <w:rPr>
-                <w:rFonts w:ascii="Times New Roman" w:hAnsi="Times New Roman"/>
-                <w:sz w:val="26"/>
-              </w:rPr>
-            </w:r>
           </w:p>
         </w:tc>
         <w:tc>
@@ -10278,12 +8848,6 @@
                 <w:szCs w:val="26"/>
               </w:rPr>
             </w:pPr>
-            <w:r>
-              <w:rPr>
-                <w:rFonts w:ascii="Times New Roman" w:hAnsi="Times New Roman"/>
-                <w:sz w:val="26"/>
-              </w:rPr>
-            </w:r>
           </w:p>
         </w:tc>
         <w:tc>
@@ -10305,12 +8869,6 @@
                 <w:szCs w:val="26"/>
               </w:rPr>
             </w:pPr>
-            <w:r>
-              <w:rPr>
-                <w:rFonts w:ascii="Times New Roman" w:hAnsi="Times New Roman"/>
-                <w:sz w:val="26"/>
-              </w:rPr>
-            </w:r>
           </w:p>
         </w:tc>
         <w:tc>
@@ -10332,12 +8890,6 @@
                 <w:szCs w:val="26"/>
               </w:rPr>
             </w:pPr>
-            <w:r>
-              <w:rPr>
-                <w:rFonts w:ascii="Times New Roman" w:hAnsi="Times New Roman"/>
-                <w:sz w:val="26"/>
-              </w:rPr>
-            </w:r>
           </w:p>
         </w:tc>
         <w:tc>
@@ -10359,12 +8911,6 @@
                 <w:szCs w:val="26"/>
               </w:rPr>
             </w:pPr>
-            <w:r>
-              <w:rPr>
-                <w:rFonts w:ascii="Times New Roman" w:hAnsi="Times New Roman"/>
-                <w:sz w:val="26"/>
-              </w:rPr>
-            </w:r>
           </w:p>
         </w:tc>
       </w:tr>
@@ -10441,12 +8987,6 @@
                 <w:szCs w:val="26"/>
               </w:rPr>
             </w:pPr>
-            <w:r>
-              <w:rPr>
-                <w:rFonts w:ascii="Times New Roman" w:hAnsi="Times New Roman"/>
-                <w:sz w:val="26"/>
-              </w:rPr>
-            </w:r>
           </w:p>
         </w:tc>
         <w:tc>
@@ -10468,12 +9008,6 @@
                 <w:szCs w:val="26"/>
               </w:rPr>
             </w:pPr>
-            <w:r>
-              <w:rPr>
-                <w:rFonts w:ascii="Times New Roman" w:hAnsi="Times New Roman"/>
-                <w:sz w:val="26"/>
-              </w:rPr>
-            </w:r>
           </w:p>
         </w:tc>
         <w:tc>
@@ -10495,12 +9029,6 @@
                 <w:szCs w:val="26"/>
               </w:rPr>
             </w:pPr>
-            <w:r>
-              <w:rPr>
-                <w:rFonts w:ascii="Times New Roman" w:hAnsi="Times New Roman"/>
-                <w:sz w:val="26"/>
-              </w:rPr>
-            </w:r>
           </w:p>
         </w:tc>
         <w:tc>
@@ -10522,12 +9050,6 @@
                 <w:szCs w:val="26"/>
               </w:rPr>
             </w:pPr>
-            <w:r>
-              <w:rPr>
-                <w:rFonts w:ascii="Times New Roman" w:hAnsi="Times New Roman"/>
-                <w:sz w:val="26"/>
-              </w:rPr>
-            </w:r>
           </w:p>
         </w:tc>
         <w:tc>
@@ -10549,12 +9071,6 @@
                 <w:szCs w:val="26"/>
               </w:rPr>
             </w:pPr>
-            <w:r>
-              <w:rPr>
-                <w:rFonts w:ascii="Times New Roman" w:hAnsi="Times New Roman"/>
-                <w:sz w:val="26"/>
-              </w:rPr>
-            </w:r>
           </w:p>
         </w:tc>
       </w:tr>
@@ -10649,27 +9165,6 @@
               <w:br/>
               <w:t>…………………………………………………………………</w:t>
             </w:r>
-            <w:r>
-              <w:rPr>
-                <w:rFonts w:ascii="Times New Roman" w:hAnsi="Times New Roman" w:cs="Times New Roman"/>
-                <w:sz w:val="26"/>
-                <w:szCs w:val="26"/>
-              </w:rPr>
-            </w:r>
-            <w:r>
-              <w:rPr>
-                <w:rFonts w:ascii="Times New Roman" w:hAnsi="Times New Roman" w:cs="Times New Roman"/>
-                <w:sz w:val="26"/>
-                <w:szCs w:val="26"/>
-              </w:rPr>
-            </w:r>
-            <w:r>
-              <w:rPr>
-                <w:rFonts w:ascii="Times New Roman" w:hAnsi="Times New Roman" w:cs="Times New Roman"/>
-                <w:sz w:val="26"/>
-                <w:szCs w:val="26"/>
-              </w:rPr>
-            </w:r>
           </w:p>
         </w:tc>
         <w:tc>
@@ -10691,30 +9186,49 @@
                 <w:sz w:val="26"/>
               </w:rPr>
               <w:t>Ngày 25 tháng 9 năm 2026</w:t>
+            </w:r>
+            <w:r>
+              <w:rPr>
+                <w:rFonts w:ascii="Times New Roman" w:hAnsi="Times New Roman"/>
+                <w:sz w:val="26"/>
+              </w:rPr>
               <w:br/>
+              <w:t>Tổ trưởng</w:t>
             </w:r>
             <w:r>
               <w:rPr>
                 <w:rFonts w:ascii="Times New Roman" w:hAnsi="Times New Roman"/>
                 <w:sz w:val="26"/>
               </w:rPr>
-              <w:t>Tổ trưởng</w:t>
               <w:br/>
+            </w:r>
+            <w:r>
+              <w:rPr>
+                <w:rFonts w:ascii="Times New Roman" w:hAnsi="Times New Roman"/>
+                <w:sz w:val="26"/>
+              </w:rPr>
               <w:br/>
+            </w:r>
+            <w:r>
+              <w:rPr>
+                <w:rFonts w:ascii="Times New Roman" w:hAnsi="Times New Roman"/>
+                <w:sz w:val="26"/>
+              </w:rPr>
               <w:br/>
+            </w:r>
+            <w:r>
+              <w:rPr>
+                <w:rFonts w:ascii="Times New Roman" w:hAnsi="Times New Roman"/>
+                <w:sz w:val="26"/>
+              </w:rPr>
               <w:br/>
-            </w:r>
-            <w:r>
-              <w:rPr>
-                <w:rFonts w:ascii="Times New Roman" w:hAnsi="Times New Roman"/>
-                <w:sz w:val="26"/>
-              </w:rPr>
               <w:t>Nguyễn Thị Ngọc Ánh</w:t>
             </w:r>
           </w:p>
         </w:tc>
       </w:tr>
     </w:tbl>
+    <w:p/>
     <w:sectPr>
       <w:headerReference w:type="default" r:id="rId7"/>
       <w:footerReference w:type="default" r:id="rId8"/>
@@ -10729,7 +9243,7 @@
 </file>
 
 <file path=word/endnotes.xml><?xml version="1.0" encoding="utf-8"?>
-<w:endnotes xmlns:wpc="http://schemas.microsoft.com/office/word/2010/wordprocessingCanvas" xmlns:cx="http://schemas.microsoft.com/office/drawing/2014/chartex" xmlns:cx1="http://schemas.microsoft.com/office/drawing/2015/9/8/chartex" xmlns:cx2="http://schemas.microsoft.com/office/drawing/2015/10/21/chartex" xmlns:cx3="http://schemas.microsoft.com/office/drawing/2016/5/9/chartex" xmlns:cx4="http://schemas.microsoft.com/office/drawing/2016/5/10/chartex" xmlns:cx5="http://schemas.microsoft.com/office/drawing/2016/5/11/chartex" xmlns:cx6="http://schemas.microsoft.com/office/drawing/2016/5/12/chartex" xmlns:cx7="http://schemas.microsoft.com/office/drawing/2016/5/13/chartex" xmlns:cx8="http://schemas.microsoft.com/office/drawing/2016/5/14/chartex" xmlns:mc="http://schemas.openxmlformats.org/markup-compatibility/2006" xmlns:aink="http://schemas.microsoft.com/office/drawing/2016/ink" xmlns:am3d="http://schemas.microsoft.com/office/drawing/2017/model3d" xmlns:o="urn:schemas-microsoft-com:office:office" xmlns:oel="http://schemas.microsoft.com/office/2019/extlst" xmlns:r="http://schemas.openxmlformats.org/officeDocument/2006/relationships" xmlns:m="http://schemas.openxmlformats.org/officeDocument/2006/math" xmlns:v="urn:schemas-microsoft-com:vml" xmlns:wp14="http://schemas.microsoft.com/office/word/2010/wordprocessingDrawing" xmlns:wp="http://schemas.openxmlformats.org/drawingml/2006/wordprocessingDrawing" xmlns:w10="urn:schemas-microsoft-com:office:word" xmlns:w="http://schemas.openxmlformats.org/wordprocessingml/2006/main" xmlns:w14="http://schemas.microsoft.com/office/word/2010/wordml" xmlns:w15="http://schemas.microsoft.com/office/word/2012/wordml" xmlns:w16cei="http://schemas.microsoft.com/office/word/2026/wordml/cei" xmlns:w16cex="http://schemas.microsoft.com/office/word/2018/wordml/cex" xmlns:w16cid="http://schemas.microsoft.com/office/word/2016/wordml/cid" xmlns:w16="http://schemas.microsoft.com/office/word/2018/wordml" xmlns:w16du="http://schemas.microsoft.com/office/word/2023/wordml/word16du" xmlns:w16sdtdh="http://schemas.microsoft.com/office/word/2020/wordml/sdtdatahash" xmlns:w16sdtfl="http://schemas.microsoft.com/office/word/2024/wordml/sdtformatlock" xmlns:w16se="http://schemas.microsoft.com/office/word/2015/wordml/symex" xmlns:wpg="http://schemas.microsoft.com/office/word/2010/wordprocessingGroup" xmlns:wpi="http://schemas.microsoft.com/office/word/2010/wordprocessingInk" xmlns:wne="http://schemas.microsoft.com/office/word/2006/wordml" xmlns:wps="http://schemas.microsoft.com/office/word/2010/wordprocessingShape" mc:Ignorable="w14 w15 w16se w16cid w16 w16cex w16sdtdh w16sdtfl w16du wp14">
+<w:endnotes xmlns:wpc="http://schemas.microsoft.com/office/word/2010/wordprocessingCanvas" xmlns:cx="http://schemas.microsoft.com/office/drawing/2014/chartex" xmlns:cx1="http://schemas.microsoft.com/office/drawing/2015/9/8/chartex" xmlns:cx2="http://schemas.microsoft.com/office/drawing/2015/10/21/chartex" xmlns:cx3="http://schemas.microsoft.com/office/drawing/2016/5/9/chartex" xmlns:cx4="http://schemas.microsoft.com/office/drawing/2016/5/10/chartex" xmlns:cx5="http://schemas.microsoft.com/office/drawing/2016/5/11/chartex" xmlns:cx6="http://schemas.microsoft.com/office/drawing/2016/5/12/chartex" xmlns:cx7="http://schemas.microsoft.com/office/drawing/2016/5/13/chartex" xmlns:cx8="http://schemas.microsoft.com/office/drawing/2016/5/14/chartex" xmlns:mc="http://schemas.openxmlformats.org/markup-compatibility/2006" xmlns:aink="http://schemas.microsoft.com/office/drawing/2016/ink" xmlns:am3d="http://schemas.microsoft.com/office/drawing/2017/model3d" xmlns:o="urn:schemas-microsoft-com:office:office" xmlns:oel="http://schemas.microsoft.com/office/2019/extlst" xmlns:r="http://schemas.openxmlformats.org/officeDocument/2006/relationships" xmlns:m="http://schemas.openxmlformats.org/officeDocument/2006/math" xmlns:v="urn:schemas-microsoft-com:vml" xmlns:wp14="http://schemas.microsoft.com/office/word/2010/wordprocessingDrawing" xmlns:wp="http://schemas.openxmlformats.org/drawingml/2006/wordprocessingDrawing" xmlns:w10="urn:schemas-microsoft-com:office:word" xmlns:w="http://schemas.openxmlformats.org/wordprocessingml/2006/main" xmlns:w14="http://schemas.microsoft.com/office/word/2010/wordml" xmlns:w15="http://schemas.microsoft.com/office/word/2012/wordml" xmlns:w16cex="http://schemas.microsoft.com/office/word/2018/wordml/cex" xmlns:w16cid="http://schemas.microsoft.com/office/word/2016/wordml/cid" xmlns:w16="http://schemas.microsoft.com/office/word/2018/wordml" xmlns:w16du="http://schemas.microsoft.com/office/word/2023/wordml/word16du" xmlns:w16sdtdh="http://schemas.microsoft.com/office/word/2020/wordml/sdtdatahash" xmlns:w16sdtfl="http://schemas.microsoft.com/office/word/2024/wordml/sdtformatlock" xmlns:w16se="http://schemas.microsoft.com/office/word/2015/wordml/symex" xmlns:wpg="http://schemas.microsoft.com/office/word/2010/wordprocessingGroup" xmlns:wpi="http://schemas.microsoft.com/office/word/2010/wordprocessingInk" xmlns:wne="http://schemas.microsoft.com/office/word/2006/wordml" xmlns:wps="http://schemas.microsoft.com/office/word/2010/wordprocessingShape" mc:Ignorable="w14 w15 w16se w16cid w16 w16cex w16sdtdh w16sdtfl w16du wp14">
   <w:endnote w:type="separator" w:id="-1">
     <w:p>
       <w:pPr>
@@ -10754,7 +9268,7 @@
 </file>
 
 <file path=word/footer1.xml><?xml version="1.0" encoding="utf-8"?>
-<w:ftr xmlns:wpc="http://schemas.microsoft.com/office/word/2010/wordprocessingCanvas" xmlns:cx="http://schemas.microsoft.com/office/drawing/2014/chartex" xmlns:cx1="http://schemas.microsoft.com/office/drawing/2015/9/8/chartex" xmlns:cx2="http://schemas.microsoft.com/office/drawing/2015/10/21/chartex" xmlns:cx3="http://schemas.microsoft.com/office/drawing/2016/5/9/chartex" xmlns:cx4="http://schemas.microsoft.com/office/drawing/2016/5/10/chartex" xmlns:cx5="http://schemas.microsoft.com/office/drawing/2016/5/11/chartex" xmlns:cx6="http://schemas.microsoft.com/office/drawing/2016/5/12/chartex" xmlns:cx7="http://schemas.microsoft.com/office/drawing/2016/5/13/chartex" xmlns:cx8="http://schemas.microsoft.com/office/drawing/2016/5/14/chartex" xmlns:mc="http://schemas.openxmlformats.org/markup-compatibility/2006" xmlns:aink="http://schemas.microsoft.com/office/drawing/2016/ink" xmlns:am3d="http://schemas.microsoft.com/office/drawing/2017/model3d" xmlns:o="urn:schemas-microsoft-com:office:office" xmlns:oel="http://schemas.microsoft.com/office/2019/extlst" xmlns:r="http://schemas.openxmlformats.org/officeDocument/2006/relationships" xmlns:m="http://schemas.openxmlformats.org/officeDocument/2006/math" xmlns:v="urn:schemas-microsoft-com:vml" xmlns:wp14="http://schemas.microsoft.com/office/word/2010/wordprocessingDrawing" xmlns:wp="http://schemas.openxmlformats.org/drawingml/2006/wordprocessingDrawing" xmlns:w10="urn:schemas-microsoft-com:office:word" xmlns:w="http://schemas.openxmlformats.org/wordprocessingml/2006/main" xmlns:w14="http://schemas.microsoft.com/office/word/2010/wordml" xmlns:w15="http://schemas.microsoft.com/office/word/2012/wordml" xmlns:w16cei="http://schemas.microsoft.com/office/word/2026/wordml/cei" xmlns:w16cex="http://schemas.microsoft.com/office/word/2018/wordml/cex" xmlns:w16cid="http://schemas.microsoft.com/office/word/2016/wordml/cid" xmlns:w16="http://schemas.microsoft.com/office/word/2018/wordml" xmlns:w16du="http://schemas.microsoft.com/office/word/2023/wordml/word16du" xmlns:w16sdtdh="http://schemas.microsoft.com/office/word/2020/wordml/sdtdatahash" xmlns:w16sdtfl="http://schemas.microsoft.com/office/word/2024/wordml/sdtformatlock" xmlns:w16se="http://schemas.microsoft.com/office/word/2015/wordml/symex" xmlns:wpg="http://schemas.microsoft.com/office/word/2010/wordprocessingGroup" xmlns:wpi="http://schemas.microsoft.com/office/word/2010/wordprocessingInk" xmlns:wne="http://schemas.microsoft.com/office/word/2006/wordml" xmlns:wps="http://schemas.microsoft.com/office/word/2010/wordprocessingShape" mc:Ignorable="w14 w15 w16se w16cid w16 w16cex w16sdtdh w16sdtfl w16du wp14">
+<w:ftr xmlns:wpc="http://schemas.microsoft.com/office/word/2010/wordprocessingCanvas" xmlns:cx="http://schemas.microsoft.com/office/drawing/2014/chartex" xmlns:cx1="http://schemas.microsoft.com/office/drawing/2015/9/8/chartex" xmlns:cx2="http://schemas.microsoft.com/office/drawing/2015/10/21/chartex" xmlns:cx3="http://schemas.microsoft.com/office/drawing/2016/5/9/chartex" xmlns:cx4="http://schemas.microsoft.com/office/drawing/2016/5/10/chartex" xmlns:cx5="http://schemas.microsoft.com/office/drawing/2016/5/11/chartex" xmlns:cx6="http://schemas.microsoft.com/office/drawing/2016/5/12/chartex" xmlns:cx7="http://schemas.microsoft.com/office/drawing/2016/5/13/chartex" xmlns:cx8="http://schemas.microsoft.com/office/drawing/2016/5/14/chartex" xmlns:mc="http://schemas.openxmlformats.org/markup-compatibility/2006" xmlns:aink="http://schemas.microsoft.com/office/drawing/2016/ink" xmlns:am3d="http://schemas.microsoft.com/office/drawing/2017/model3d" xmlns:o="urn:schemas-microsoft-com:office:office" xmlns:oel="http://schemas.microsoft.com/office/2019/extlst" xmlns:r="http://schemas.openxmlformats.org/officeDocument/2006/relationships" xmlns:m="http://schemas.openxmlformats.org/officeDocument/2006/math" xmlns:v="urn:schemas-microsoft-com:vml" xmlns:wp14="http://schemas.microsoft.com/office/word/2010/wordprocessingDrawing" xmlns:wp="http://schemas.openxmlformats.org/drawingml/2006/wordprocessingDrawing" xmlns:w10="urn:schemas-microsoft-com:office:word" xmlns:w="http://schemas.openxmlformats.org/wordprocessingml/2006/main" xmlns:w14="http://schemas.microsoft.com/office/word/2010/wordml" xmlns:w15="http://schemas.microsoft.com/office/word/2012/wordml" xmlns:w16cex="http://schemas.microsoft.com/office/word/2018/wordml/cex" xmlns:w16cid="http://schemas.microsoft.com/office/word/2016/wordml/cid" xmlns:w16="http://schemas.microsoft.com/office/word/2018/wordml" xmlns:w16du="http://schemas.microsoft.com/office/word/2023/wordml/word16du" xmlns:w16sdtdh="http://schemas.microsoft.com/office/word/2020/wordml/sdtdatahash" xmlns:w16sdtfl="http://schemas.microsoft.com/office/word/2024/wordml/sdtformatlock" xmlns:w16se="http://schemas.microsoft.com/office/word/2015/wordml/symex" xmlns:wpg="http://schemas.microsoft.com/office/word/2010/wordprocessingGroup" xmlns:wpi="http://schemas.microsoft.com/office/word/2010/wordprocessingInk" xmlns:wne="http://schemas.microsoft.com/office/word/2006/wordml" xmlns:wps="http://schemas.microsoft.com/office/word/2010/wordprocessingShape" mc:Ignorable="w14 w15 w16se w16cid w16 w16cex w16sdtdh w16sdtfl w16du wp14">
   <w:p>
     <w:pPr>
       <w:pBdr>
@@ -10833,7 +9347,7 @@
 </file>
 
 <file path=word/footnotes.xml><?xml version="1.0" encoding="utf-8"?>
-<w:footnotes xmlns:wpc="http://schemas.microsoft.com/office/word/2010/wordprocessingCanvas" xmlns:cx="http://schemas.microsoft.com/office/drawing/2014/chartex" xmlns:cx1="http://schemas.microsoft.com/office/drawing/2015/9/8/chartex" xmlns:cx2="http://schemas.microsoft.com/office/drawing/2015/10/21/chartex" xmlns:cx3="http://schemas.microsoft.com/office/drawing/2016/5/9/chartex" xmlns:cx4="http://schemas.microsoft.com/office/drawing/2016/5/10/chartex" xmlns:cx5="http://schemas.microsoft.com/office/drawing/2016/5/11/chartex" xmlns:cx6="http://schemas.microsoft.com/office/drawing/2016/5/12/chartex" xmlns:cx7="http://schemas.microsoft.com/office/drawing/2016/5/13/chartex" xmlns:cx8="http://schemas.microsoft.com/office/drawing/2016/5/14/chartex" xmlns:mc="http://schemas.openxmlformats.org/markup-compatibility/2006" xmlns:aink="http://schemas.microsoft.com/office/drawing/2016/ink" xmlns:am3d="http://schemas.microsoft.com/office/drawing/2017/model3d" xmlns:o="urn:schemas-microsoft-com:office:office" xmlns:oel="http://schemas.microsoft.com/office/2019/extlst" xmlns:r="http://schemas.openxmlformats.org/officeDocument/2006/relationships" xmlns:m="http://schemas.openxmlformats.org/officeDocument/2006/math" xmlns:v="urn:schemas-microsoft-com:vml" xmlns:wp14="http://schemas.microsoft.com/office/word/2010/wordprocessingDrawing" xmlns:wp="http://schemas.openxmlformats.org/drawingml/2006/wordprocessingDrawing" xmlns:w10="urn:schemas-microsoft-com:office:word" xmlns:w="http://schemas.openxmlformats.org/wordprocessingml/2006/main" xmlns:w14="http://schemas.microsoft.com/office/word/2010/wordml" xmlns:w15="http://schemas.microsoft.com/office/word/2012/wordml" xmlns:w16cei="http://schemas.microsoft.com/office/word/2026/wordml/cei" xmlns:w16cex="http://schemas.microsoft.com/office/word/2018/wordml/cex" xmlns:w16cid="http://schemas.microsoft.com/office/word/2016/wordml/cid" xmlns:w16="http://schemas.microsoft.com/office/word/2018/wordml" xmlns:w16du="http://schemas.microsoft.com/office/word/2023/wordml/word16du" xmlns:w16sdtdh="http://schemas.microsoft.com/office/word/2020/wordml/sdtdatahash" xmlns:w16sdtfl="http://schemas.microsoft.com/office/word/2024/wordml/sdtformatlock" xmlns:w16se="http://schemas.microsoft.com/office/word/2015/wordml/symex" xmlns:wpg="http://schemas.microsoft.com/office/word/2010/wordprocessingGroup" xmlns:wpi="http://schemas.microsoft.com/office/word/2010/wordprocessingInk" xmlns:wne="http://schemas.microsoft.com/office/word/2006/wordml" xmlns:wps="http://schemas.microsoft.com/office/word/2010/wordprocessingShape" mc:Ignorable="w14 w15 w16se w16cid w16 w16cex w16sdtdh w16sdtfl w16du wp14">
+<w:footnotes xmlns:wpc="http://schemas.microsoft.com/office/word/2010/wordprocessingCanvas" xmlns:cx="http://schemas.microsoft.com/office/drawing/2014/chartex" xmlns:cx1="http://schemas.microsoft.com/office/drawing/2015/9/8/chartex" xmlns:cx2="http://schemas.microsoft.com/office/drawing/2015/10/21/chartex" xmlns:cx3="http://schemas.microsoft.com/office/drawing/2016/5/9/chartex" xmlns:cx4="http://schemas.microsoft.com/office/drawing/2016/5/10/chartex" xmlns:cx5="http://schemas.microsoft.com/office/drawing/2016/5/11/chartex" xmlns:cx6="http://schemas.microsoft.com/office/drawing/2016/5/12/chartex" xmlns:cx7="http://schemas.microsoft.com/office/drawing/2016/5/13/chartex" xmlns:cx8="http://schemas.microsoft.com/office/drawing/2016/5/14/chartex" xmlns:mc="http://schemas.openxmlformats.org/markup-compatibility/2006" xmlns:aink="http://schemas.microsoft.com/office/drawing/2016/ink" xmlns:am3d="http://schemas.microsoft.com/office/drawing/2017/model3d" xmlns:o="urn:schemas-microsoft-com:office:office" xmlns:oel="http://schemas.microsoft.com/office/2019/extlst" xmlns:r="http://schemas.openxmlformats.org/officeDocument/2006/relationships" xmlns:m="http://schemas.openxmlformats.org/officeDocument/2006/math" xmlns:v="urn:schemas-microsoft-com:vml" xmlns:wp14="http://schemas.microsoft.com/office/word/2010/wordprocessingDrawing" xmlns:wp="http://schemas.openxmlformats.org/drawingml/2006/wordprocessingDrawing" xmlns:w10="urn:schemas-microsoft-com:office:word" xmlns:w="http://schemas.openxmlformats.org/wordprocessingml/2006/main" xmlns:w14="http://schemas.microsoft.com/office/word/2010/wordml" xmlns:w15="http://schemas.microsoft.com/office/word/2012/wordml" xmlns:w16cex="http://schemas.microsoft.com/office/word/2018/wordml/cex" xmlns:w16cid="http://schemas.microsoft.com/office/word/2016/wordml/cid" xmlns:w16="http://schemas.microsoft.com/office/word/2018/wordml" xmlns:w16du="http://schemas.microsoft.com/office/word/2023/wordml/word16du" xmlns:w16sdtdh="http://schemas.microsoft.com/office/word/2020/wordml/sdtdatahash" xmlns:w16sdtfl="http://schemas.microsoft.com/office/word/2024/wordml/sdtformatlock" xmlns:w16se="http://schemas.microsoft.com/office/word/2015/wordml/symex" xmlns:wpg="http://schemas.microsoft.com/office/word/2010/wordprocessingGroup" xmlns:wpi="http://schemas.microsoft.com/office/word/2010/wordprocessingInk" xmlns:wne="http://schemas.microsoft.com/office/word/2006/wordml" xmlns:wps="http://schemas.microsoft.com/office/word/2010/wordprocessingShape" mc:Ignorable="w14 w15 w16se w16cid w16 w16cex w16sdtdh w16sdtfl w16du wp14">
   <w:footnote w:type="separator" w:id="-1">
     <w:p>
       <w:pPr>
@@ -10858,7 +9372,7 @@
 </file>
 
 <file path=word/header1.xml><?xml version="1.0" encoding="utf-8"?>
-<w:hdr xmlns:wpc="http://schemas.microsoft.com/office/word/2010/wordprocessingCanvas" xmlns:cx="http://schemas.microsoft.com/office/drawing/2014/chartex" xmlns:cx1="http://schemas.microsoft.com/office/drawing/2015/9/8/chartex" xmlns:cx2="http://schemas.microsoft.com/office/drawing/2015/10/21/chartex" xmlns:cx3="http://schemas.microsoft.com/office/drawing/2016/5/9/chartex" xmlns:cx4="http://schemas.microsoft.com/office/drawing/2016/5/10/chartex" xmlns:cx5="http://schemas.microsoft.com/office/drawing/2016/5/11/chartex" xmlns:cx6="http://schemas.microsoft.com/office/drawing/2016/5/12/chartex" xmlns:cx7="http://schemas.microsoft.com/office/drawing/2016/5/13/chartex" xmlns:cx8="http://schemas.microsoft.com/office/drawing/2016/5/14/chartex" xmlns:mc="http://schemas.openxmlformats.org/markup-compatibility/2006" xmlns:aink="http://schemas.microsoft.com/office/drawing/2016/ink" xmlns:am3d="http://schemas.microsoft.com/office/drawing/2017/model3d" xmlns:o="urn:schemas-microsoft-com:office:office" xmlns:oel="http://schemas.microsoft.com/office/2019/extlst" xmlns:r="http://schemas.openxmlformats.org/officeDocument/2006/relationships" xmlns:m="http://schemas.openxmlformats.org/officeDocument/2006/math" xmlns:v="urn:schemas-microsoft-com:vml" xmlns:wp14="http://schemas.microsoft.com/office/word/2010/wordprocessingDrawing" xmlns:wp="http://schemas.openxmlformats.org/drawingml/2006/wordprocessingDrawing" xmlns:w10="urn:schemas-microsoft-com:office:word" xmlns:w="http://schemas.openxmlformats.org/wordprocessingml/2006/main" xmlns:w14="http://schemas.microsoft.com/office/word/2010/wordml" xmlns:w15="http://schemas.microsoft.com/office/word/2012/wordml" xmlns:w16cei="http://schemas.microsoft.com/office/word/2026/wordml/cei" xmlns:w16cex="http://schemas.microsoft.com/office/word/2018/wordml/cex" xmlns:w16cid="http://schemas.microsoft.com/office/word/2016/wordml/cid" xmlns:w16="http://schemas.microsoft.com/office/word/2018/wordml" xmlns:w16du="http://schemas.microsoft.com/office/word/2023/wordml/word16du" xmlns:w16sdtdh="http://schemas.microsoft.com/office/word/2020/wordml/sdtdatahash" xmlns:w16sdtfl="http://schemas.microsoft.com/office/word/2024/wordml/sdtformatlock" xmlns:w16se="http://schemas.microsoft.com/office/word/2015/wordml/symex" xmlns:wpg="http://schemas.microsoft.com/office/word/2010/wordprocessingGroup" xmlns:wpi="http://schemas.microsoft.com/office/word/2010/wordprocessingInk" xmlns:wne="http://schemas.microsoft.com/office/word/2006/wordml" xmlns:wps="http://schemas.microsoft.com/office/word/2010/wordprocessingShape" mc:Ignorable="w14 w15 w16se w16cid w16 w16cex w16sdtdh w16sdtfl w16du wp14">
+<w:hdr xmlns:wpc="http://schemas.microsoft.com/office/word/2010/wordprocessingCanvas" xmlns:cx="http://schemas.microsoft.com/office/drawing/2014/chartex" xmlns:cx1="http://schemas.microsoft.com/office/drawing/2015/9/8/chartex" xmlns:cx2="http://schemas.microsoft.com/office/drawing/2015/10/21/chartex" xmlns:cx3="http://schemas.microsoft.com/office/drawing/2016/5/9/chartex" xmlns:cx4="http://schemas.microsoft.com/office/drawing/2016/5/10/chartex" xmlns:cx5="http://schemas.microsoft.com/office/drawing/2016/5/11/chartex" xmlns:cx6="http://schemas.microsoft.com/office/drawing/2016/5/12/chartex" xmlns:cx7="http://schemas.microsoft.com/office/drawing/2016/5/13/chartex" xmlns:cx8="http://schemas.microsoft.com/office/drawing/2016/5/14/chartex" xmlns:mc="http://schemas.openxmlformats.org/markup-compatibility/2006" xmlns:aink="http://schemas.microsoft.com/office/drawing/2016/ink" xmlns:am3d="http://schemas.microsoft.com/office/drawing/2017/model3d" xmlns:o="urn:schemas-microsoft-com:office:office" xmlns:oel="http://schemas.microsoft.com/office/2019/extlst" xmlns:r="http://schemas.openxmlformats.org/officeDocument/2006/relationships" xmlns:m="http://schemas.openxmlformats.org/officeDocument/2006/math" xmlns:v="urn:schemas-microsoft-com:vml" xmlns:wp14="http://schemas.microsoft.com/office/word/2010/wordprocessingDrawing" xmlns:wp="http://schemas.openxmlformats.org/drawingml/2006/wordprocessingDrawing" xmlns:w10="urn:schemas-microsoft-com:office:word" xmlns:w="http://schemas.openxmlformats.org/wordprocessingml/2006/main" xmlns:w14="http://schemas.microsoft.com/office/word/2010/wordml" xmlns:w15="http://schemas.microsoft.com/office/word/2012/wordml" xmlns:w16cex="http://schemas.microsoft.com/office/word/2018/wordml/cex" xmlns:w16cid="http://schemas.microsoft.com/office/word/2016/wordml/cid" xmlns:w16="http://schemas.microsoft.com/office/word/2018/wordml" xmlns:w16du="http://schemas.microsoft.com/office/word/2023/wordml/word16du" xmlns:w16sdtdh="http://schemas.microsoft.com/office/word/2020/wordml/sdtdatahash" xmlns:w16sdtfl="http://schemas.microsoft.com/office/word/2024/wordml/sdtformatlock" xmlns:w16se="http://schemas.microsoft.com/office/word/2015/wordml/symex" xmlns:wpg="http://schemas.microsoft.com/office/word/2010/wordprocessingGroup" xmlns:wpi="http://schemas.microsoft.com/office/word/2010/wordprocessingInk" xmlns:wne="http://schemas.microsoft.com/office/word/2006/wordml" xmlns:wps="http://schemas.microsoft.com/office/word/2010/wordprocessingShape" mc:Ignorable="w14 w15 w16se w16cid w16 w16cex w16sdtdh w16sdtfl w16du wp14">
   <w:p>
     <w:pPr>
       <w:pStyle w:val="Header"/>

</xml_diff>